<commit_message>
Updated TSC documentation for NS 1300 and NS ICMm
</commit_message>
<xml_diff>
--- a/profiles/documentation/tsc_ns_1300_dc_thejag.docx
+++ b/profiles/documentation/tsc_ns_1300_dc_thejag.docx
@@ -32,9 +32,9 @@
           </w:tcPr>
           <w:p>
             <w:pPr>
-              <w:jc w:val="both"/>
-              <w:rPr>
-                <w:rFonts w:ascii="Franklin Gothic Medium Cond" w:hAnsi="Franklin Gothic Medium Cond" w:cs="Aldhabi"/>
+              <w:jc w:val="center"/>
+              <w:rPr>
+                <w:rFonts w:ascii="Magneto" w:hAnsi="Magneto" w:cs="Aldhabi"/>
                 <w:b/>
                 <w:bCs/>
                 <w:color w:val="FFFFFF" w:themeColor="background1"/>
@@ -42,28 +42,6 @@
                 <w:szCs w:val="20"/>
               </w:rPr>
             </w:pPr>
-            <w:r>
-              <w:rPr>
-                <w:rFonts w:ascii="Franklin Gothic Medium Cond" w:hAnsi="Franklin Gothic Medium Cond" w:cs="Aldhabi"/>
-                <w:b/>
-                <w:bCs/>
-                <w:color w:val="FFFFFF" w:themeColor="background1"/>
-                <w:sz w:val="20"/>
-                <w:szCs w:val="20"/>
-              </w:rPr>
-              <w:t>TSW Controller Utility Profile</w:t>
-            </w:r>
-            <w:r>
-              <w:rPr>
-                <w:rFonts w:ascii="Franklin Gothic Medium Cond" w:hAnsi="Franklin Gothic Medium Cond" w:cs="Aldhabi"/>
-                <w:b/>
-                <w:bCs/>
-                <w:color w:val="FFFFFF" w:themeColor="background1"/>
-                <w:sz w:val="20"/>
-                <w:szCs w:val="20"/>
-              </w:rPr>
-              <w:t xml:space="preserve"> | TCA Airbus</w:t>
-            </w:r>
           </w:p>
         </w:tc>
         <w:tc>
@@ -74,7 +52,7 @@
           </w:tcPr>
           <w:p>
             <w:pPr>
-              <w:jc w:val="right"/>
+              <w:jc w:val="center"/>
               <w:rPr>
                 <w:rFonts w:ascii="Magneto" w:hAnsi="Magneto" w:cs="Aldhabi"/>
                 <w:b/>
@@ -89,11 +67,12 @@
       </w:tr>
       <w:tr>
         <w:trPr>
-          <w:trHeight w:val="881"/>
+          <w:trHeight w:val="234"/>
         </w:trPr>
         <w:tc>
           <w:tcPr>
             <w:tcW w:w="1129" w:type="dxa"/>
+            <w:vMerge w:val="restart"/>
             <w:vAlign w:val="center"/>
           </w:tcPr>
           <w:p>
@@ -105,6 +84,9 @@
               </w:rPr>
             </w:pPr>
             <w:r>
+              <w:rPr>
+                <w:noProof/>
+              </w:rPr>
               <w:drawing>
                 <wp:inline distT="0" distB="0" distL="0" distR="0" wp14:anchorId="6543BDCD" wp14:editId="52CFD69B">
                   <wp:extent cx="532932" cy="324844"/>
@@ -178,49 +160,21 @@
             </w:pPr>
             <w:r>
               <w:rPr>
-                <w:rFonts w:asciiTheme="majorHAnsi" w:hAnsiTheme="majorHAnsi"/>
+                <w:rFonts w:ascii="Franklin Gothic Medium Cond" w:hAnsi="Franklin Gothic Medium Cond" w:cs="Aldhabi"/>
                 <w:b/>
                 <w:bCs/>
-                <w:color w:val="003082"/>
-                <w:sz w:val="36"/>
-                <w:szCs w:val="36"/>
-              </w:rPr>
-              <w:t>Dutch Classics</w:t>
-            </w:r>
-            <w:r>
-              <w:rPr>
-                <w:rFonts w:asciiTheme="majorHAnsi" w:hAnsiTheme="majorHAnsi"/>
-                <w:b/>
-                <w:bCs/>
-                <w:color w:val="003082"/>
-                <w:sz w:val="36"/>
-                <w:szCs w:val="36"/>
-              </w:rPr>
-              <w:t xml:space="preserve"> NS </w:t>
-            </w:r>
-            <w:r>
-              <w:rPr>
-                <w:rFonts w:asciiTheme="majorHAnsi" w:hAnsiTheme="majorHAnsi"/>
-                <w:b/>
-                <w:bCs/>
-                <w:color w:val="003082"/>
-                <w:sz w:val="36"/>
-                <w:szCs w:val="36"/>
-              </w:rPr>
-              <w:t>1300</w:t>
-            </w:r>
-            <w:r>
-              <w:rPr>
-                <w:sz w:val="32"/>
-                <w:szCs w:val="32"/>
-              </w:rPr>
-              <w:t xml:space="preserve"> </w:t>
+                <w:color w:val="FFFFFF" w:themeColor="background1"/>
+                <w:sz w:val="20"/>
+                <w:szCs w:val="20"/>
+              </w:rPr>
+              <w:t>TSW Controller Utility Profile | TCA Airbus</w:t>
             </w:r>
           </w:p>
         </w:tc>
         <w:tc>
           <w:tcPr>
             <w:tcW w:w="1292" w:type="dxa"/>
+            <w:vMerge w:val="restart"/>
             <w:vAlign w:val="center"/>
           </w:tcPr>
           <w:p>
@@ -233,6 +187,9 @@
               </w:rPr>
             </w:pPr>
             <w:r>
+              <w:rPr>
+                <w:noProof/>
+              </w:rPr>
               <w:drawing>
                 <wp:inline distT="0" distB="0" distL="0" distR="0" wp14:anchorId="1C31FED1" wp14:editId="35E5D423">
                   <wp:extent cx="381600" cy="381600"/>
@@ -280,6 +237,78 @@
         </w:tc>
       </w:tr>
       <w:tr>
+        <w:trPr>
+          <w:trHeight w:val="233"/>
+        </w:trPr>
+        <w:tc>
+          <w:tcPr>
+            <w:tcW w:w="1129" w:type="dxa"/>
+            <w:vMerge/>
+            <w:vAlign w:val="center"/>
+          </w:tcPr>
+          <w:p>
+            <w:pPr>
+              <w:rPr>
+                <w:noProof/>
+              </w:rPr>
+            </w:pPr>
+          </w:p>
+        </w:tc>
+        <w:tc>
+          <w:tcPr>
+            <w:tcW w:w="8364" w:type="dxa"/>
+            <w:gridSpan w:val="2"/>
+            <w:vAlign w:val="center"/>
+          </w:tcPr>
+          <w:p>
+            <w:pPr>
+              <w:jc w:val="center"/>
+              <w:rPr>
+                <w:rFonts w:asciiTheme="majorHAnsi" w:hAnsiTheme="majorHAnsi"/>
+                <w:b/>
+                <w:bCs/>
+                <w:color w:val="003082"/>
+                <w:sz w:val="36"/>
+                <w:szCs w:val="36"/>
+              </w:rPr>
+            </w:pPr>
+            <w:r>
+              <w:rPr>
+                <w:rFonts w:asciiTheme="majorHAnsi" w:hAnsiTheme="majorHAnsi"/>
+                <w:b/>
+                <w:bCs/>
+                <w:color w:val="003082"/>
+                <w:sz w:val="36"/>
+                <w:szCs w:val="36"/>
+              </w:rPr>
+              <w:t>Dutch Classics NS 1300</w:t>
+            </w:r>
+            <w:r>
+              <w:rPr>
+                <w:sz w:val="32"/>
+                <w:szCs w:val="32"/>
+              </w:rPr>
+              <w:t xml:space="preserve"> </w:t>
+            </w:r>
+          </w:p>
+        </w:tc>
+        <w:tc>
+          <w:tcPr>
+            <w:tcW w:w="1292" w:type="dxa"/>
+            <w:vMerge/>
+            <w:vAlign w:val="center"/>
+          </w:tcPr>
+          <w:p>
+            <w:pPr>
+              <w:jc w:val="center"/>
+              <w:rPr>
+                <w:noProof/>
+              </w:rPr>
+            </w:pPr>
+          </w:p>
+        </w:tc>
+      </w:tr>
+      <w:tr>
         <w:tc>
           <w:tcPr>
             <w:tcW w:w="10785" w:type="dxa"/>
@@ -322,6 +351,9 @@
               </w:rPr>
             </w:pPr>
             <w:r>
+              <w:rPr>
+                <w:noProof/>
+              </w:rPr>
               <w:drawing>
                 <wp:inline distT="0" distB="0" distL="0" distR="0" wp14:anchorId="0048250F" wp14:editId="76250D9A">
                   <wp:extent cx="913676" cy="288000"/>
@@ -372,6 +404,9 @@
               </w:drawing>
             </w:r>
             <w:r>
+              <w:rPr>
+                <w:noProof/>
+              </w:rPr>
               <w:drawing>
                 <wp:inline distT="0" distB="0" distL="0" distR="0" wp14:anchorId="65D61B23" wp14:editId="7C7D835A">
                   <wp:extent cx="913673" cy="288000"/>
@@ -422,6 +457,9 @@
               </w:drawing>
             </w:r>
             <w:r>
+              <w:rPr>
+                <w:noProof/>
+              </w:rPr>
               <w:drawing>
                 <wp:inline distT="0" distB="0" distL="0" distR="0" wp14:anchorId="4FD895F5" wp14:editId="74F1D4CC">
                   <wp:extent cx="913673" cy="288000"/>
@@ -472,6 +510,9 @@
               </w:drawing>
             </w:r>
             <w:r>
+              <w:rPr>
+                <w:noProof/>
+              </w:rPr>
               <w:drawing>
                 <wp:inline distT="0" distB="0" distL="0" distR="0" wp14:anchorId="65C503C4" wp14:editId="41690501">
                   <wp:extent cx="913673" cy="288000"/>
@@ -585,6 +626,7 @@
             </w:pPr>
             <w:r>
               <w:rPr>
+                <w:noProof/>
                 <w:color w:val="FFFFFF" w:themeColor="background1"/>
                 <w:sz w:val="32"/>
                 <w:szCs w:val="32"/>
@@ -592,7 +634,7 @@
               <mc:AlternateContent>
                 <mc:Choice Requires="wps">
                   <w:drawing>
-                    <wp:anchor distT="0" distB="0" distL="114300" distR="114300" simplePos="0" relativeHeight="251728896" behindDoc="0" locked="0" layoutInCell="1" allowOverlap="1" wp14:anchorId="3EDB4A9A" wp14:editId="09080A6F">
+                    <wp:anchor distT="0" distB="0" distL="114300" distR="114300" simplePos="0" relativeHeight="251793408" behindDoc="0" locked="0" layoutInCell="1" allowOverlap="1" wp14:anchorId="3EDB4A9A" wp14:editId="09080A6F">
                       <wp:simplePos x="0" y="0"/>
                       <wp:positionH relativeFrom="column">
                         <wp:posOffset>1290320</wp:posOffset>
@@ -669,7 +711,7 @@
                 </mc:Choice>
                 <mc:Fallback>
                   <w:pict>
-                    <v:rect w14:anchorId="3EDB4A9A" id="Rectangle 1" o:spid="_x0000_s1026" style="position:absolute;left:0;text-align:left;margin-left:101.6pt;margin-top:365pt;width:50.25pt;height:51.6pt;z-index:251728896;visibility:visible;mso-wrap-style:square;mso-width-percent:0;mso-height-percent:0;mso-wrap-distance-left:9pt;mso-wrap-distance-top:0;mso-wrap-distance-right:9pt;mso-wrap-distance-bottom:0;mso-position-horizontal:absolute;mso-position-horizontal-relative:text;mso-position-vertical:absolute;mso-position-vertical-relative:text;mso-width-percent:0;mso-height-percent:0;mso-width-relative:margin;mso-height-relative:margin;v-text-anchor:middle" o:gfxdata="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" filled="f" strokecolor="red" strokeweight="1pt">
+                    <v:rect w14:anchorId="3EDB4A9A" id="Rectangle 1" o:spid="_x0000_s1026" style="position:absolute;left:0;text-align:left;margin-left:101.6pt;margin-top:365pt;width:50.25pt;height:51.6pt;z-index:251793408;visibility:visible;mso-wrap-style:square;mso-width-percent:0;mso-height-percent:0;mso-wrap-distance-left:9pt;mso-wrap-distance-top:0;mso-wrap-distance-right:9pt;mso-wrap-distance-bottom:0;mso-position-horizontal:absolute;mso-position-horizontal-relative:text;mso-position-vertical:absolute;mso-position-vertical-relative:text;mso-width-percent:0;mso-height-percent:0;mso-width-relative:margin;mso-height-relative:margin;v-text-anchor:middle" o:gfxdata="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" filled="f" strokecolor="red" strokeweight="1pt">
                       <v:textbox inset="0,0,0,0">
                         <w:txbxContent>
                           <w:p>
@@ -694,7 +736,7 @@
               <mc:AlternateContent>
                 <mc:Choice Requires="wps">
                   <w:drawing>
-                    <wp:anchor distT="0" distB="0" distL="114300" distR="114300" simplePos="0" relativeHeight="251729920" behindDoc="0" locked="0" layoutInCell="1" allowOverlap="1" wp14:anchorId="03B7266F" wp14:editId="1EABF0BB">
+                    <wp:anchor distT="0" distB="0" distL="114300" distR="114300" simplePos="0" relativeHeight="251794432" behindDoc="0" locked="0" layoutInCell="1" allowOverlap="1" wp14:anchorId="03B7266F" wp14:editId="1EABF0BB">
                       <wp:simplePos x="0" y="0"/>
                       <wp:positionH relativeFrom="column">
                         <wp:posOffset>1109345</wp:posOffset>
@@ -755,11 +797,11 @@
                 </mc:Choice>
                 <mc:Fallback>
                   <w:pict>
-                    <v:shapetype w14:anchorId="0D291D8F" id="_x0000_t32" coordsize="21600,21600" o:spt="32" o:oned="t" path="m,l21600,21600e" filled="f">
+                    <v:shapetype w14:anchorId="3FF150A8" id="_x0000_t32" coordsize="21600,21600" o:spt="32" o:oned="t" path="m,l21600,21600e" filled="f">
                       <v:path arrowok="t" fillok="f" o:connecttype="none"/>
                       <o:lock v:ext="edit" shapetype="t"/>
                     </v:shapetype>
-                    <v:shape id="Straight Arrow Connector 6" o:spid="_x0000_s1026" type="#_x0000_t32" style="position:absolute;margin-left:87.35pt;margin-top:392pt;width:14.25pt;height:.25pt;flip:x;z-index:251729920;visibility:visible;mso-wrap-style:square;mso-width-percent:0;mso-height-percent:0;mso-wrap-distance-left:9pt;mso-wrap-distance-top:0;mso-wrap-distance-right:9pt;mso-wrap-distance-bottom:0;mso-position-horizontal:absolute;mso-position-horizontal-relative:text;mso-position-vertical:absolute;mso-position-vertical-relative:text;mso-width-percent:0;mso-height-percent:0;mso-width-relative:margin;mso-height-relative:margin" o:gfxdata="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" strokecolor="red" strokeweight="1.5pt">
+                    <v:shape id="Straight Arrow Connector 6" o:spid="_x0000_s1026" type="#_x0000_t32" style="position:absolute;margin-left:87.35pt;margin-top:392pt;width:14.25pt;height:.25pt;flip:x;z-index:251794432;visibility:visible;mso-wrap-style:square;mso-width-percent:0;mso-height-percent:0;mso-wrap-distance-left:9pt;mso-wrap-distance-top:0;mso-wrap-distance-right:9pt;mso-wrap-distance-bottom:0;mso-position-horizontal:absolute;mso-position-horizontal-relative:text;mso-position-vertical:absolute;mso-position-vertical-relative:text;mso-width-percent:0;mso-height-percent:0;mso-width-relative:margin;mso-height-relative:margin" o:gfxdata="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" strokecolor="red" strokeweight="1.5pt">
                       <v:stroke endarrow="block" joinstyle="miter"/>
                     </v:shape>
                   </w:pict>
@@ -768,6 +810,7 @@
             </w:r>
             <w:r>
               <w:rPr>
+                <w:noProof/>
                 <w:color w:val="FFFFFF" w:themeColor="background1"/>
                 <w:sz w:val="32"/>
                 <w:szCs w:val="32"/>
@@ -775,7 +818,7 @@
               <mc:AlternateContent>
                 <mc:Choice Requires="wps">
                   <w:drawing>
-                    <wp:anchor distT="0" distB="0" distL="114300" distR="114300" simplePos="0" relativeHeight="251726848" behindDoc="0" locked="0" layoutInCell="1" allowOverlap="1" wp14:anchorId="3D00F519" wp14:editId="0C9444BF">
+                    <wp:anchor distT="0" distB="0" distL="114300" distR="114300" simplePos="0" relativeHeight="251792384" behindDoc="0" locked="0" layoutInCell="1" allowOverlap="1" wp14:anchorId="3D00F519" wp14:editId="0C9444BF">
                       <wp:simplePos x="0" y="0"/>
                       <wp:positionH relativeFrom="column">
                         <wp:posOffset>3235325</wp:posOffset>
@@ -845,7 +888,7 @@
                 </mc:Choice>
                 <mc:Fallback>
                   <w:pict>
-                    <v:oval w14:anchorId="63A91B5C" id="Oval 1" o:spid="_x0000_s1026" style="position:absolute;margin-left:254.75pt;margin-top:376.35pt;width:7.5pt;height:7.5pt;z-index:251726848;visibility:visible;mso-wrap-style:square;mso-width-percent:0;mso-height-percent:0;mso-wrap-distance-left:9pt;mso-wrap-distance-top:0;mso-wrap-distance-right:9pt;mso-wrap-distance-bottom:0;mso-position-horizontal:absolute;mso-position-horizontal-relative:text;mso-position-vertical:absolute;mso-position-vertical-relative:text;mso-width-percent:0;mso-height-percent:0;mso-width-relative:margin;mso-height-relative:margin;v-text-anchor:middle" o:gfxdata="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" fillcolor="#00b050" strokecolor="white [3212]">
+                    <v:oval w14:anchorId="10637C8A" id="Oval 1" o:spid="_x0000_s1026" style="position:absolute;margin-left:254.75pt;margin-top:376.35pt;width:7.5pt;height:7.5pt;z-index:251792384;visibility:visible;mso-wrap-style:square;mso-width-percent:0;mso-height-percent:0;mso-wrap-distance-left:9pt;mso-wrap-distance-top:0;mso-wrap-distance-right:9pt;mso-wrap-distance-bottom:0;mso-position-horizontal:absolute;mso-position-horizontal-relative:text;mso-position-vertical:absolute;mso-position-vertical-relative:text;mso-width-percent:0;mso-height-percent:0;mso-width-relative:margin;mso-height-relative:margin;v-text-anchor:middle" o:gfxdata="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" fillcolor="#00b050" strokecolor="white [3212]">
                       <v:stroke joinstyle="miter"/>
                     </v:oval>
                   </w:pict>
@@ -854,6 +897,7 @@
             </w:r>
             <w:r>
               <w:rPr>
+                <w:noProof/>
                 <w:color w:val="FFFFFF" w:themeColor="background1"/>
                 <w:sz w:val="32"/>
                 <w:szCs w:val="32"/>
@@ -861,7 +905,7 @@
               <mc:AlternateContent>
                 <mc:Choice Requires="wps">
                   <w:drawing>
-                    <wp:anchor distT="0" distB="0" distL="114300" distR="114300" simplePos="0" relativeHeight="251724800" behindDoc="0" locked="0" layoutInCell="1" allowOverlap="1" wp14:anchorId="512AE537" wp14:editId="4455057A">
+                    <wp:anchor distT="0" distB="0" distL="114300" distR="114300" simplePos="0" relativeHeight="251791360" behindDoc="0" locked="0" layoutInCell="1" allowOverlap="1" wp14:anchorId="512AE537" wp14:editId="4455057A">
                       <wp:simplePos x="0" y="0"/>
                       <wp:positionH relativeFrom="column">
                         <wp:posOffset>4891323</wp:posOffset>
@@ -931,7 +975,7 @@
                 </mc:Choice>
                 <mc:Fallback>
                   <w:pict>
-                    <v:oval w14:anchorId="4DAB13A0" id="Oval 1" o:spid="_x0000_s1026" style="position:absolute;margin-left:385.15pt;margin-top:416.9pt;width:7.5pt;height:7.5pt;z-index:251724800;visibility:visible;mso-wrap-style:square;mso-width-percent:0;mso-height-percent:0;mso-wrap-distance-left:9pt;mso-wrap-distance-top:0;mso-wrap-distance-right:9pt;mso-wrap-distance-bottom:0;mso-position-horizontal:absolute;mso-position-horizontal-relative:text;mso-position-vertical:absolute;mso-position-vertical-relative:text;mso-width-percent:0;mso-height-percent:0;mso-width-relative:margin;mso-height-relative:margin;v-text-anchor:middle" o:gfxdata="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" fillcolor="#00b050" strokecolor="white [3212]">
+                    <v:oval w14:anchorId="58212774" id="Oval 1" o:spid="_x0000_s1026" style="position:absolute;margin-left:385.15pt;margin-top:416.9pt;width:7.5pt;height:7.5pt;z-index:251791360;visibility:visible;mso-wrap-style:square;mso-width-percent:0;mso-height-percent:0;mso-wrap-distance-left:9pt;mso-wrap-distance-top:0;mso-wrap-distance-right:9pt;mso-wrap-distance-bottom:0;mso-position-horizontal:absolute;mso-position-horizontal-relative:text;mso-position-vertical:absolute;mso-position-vertical-relative:text;mso-width-percent:0;mso-height-percent:0;mso-width-relative:margin;mso-height-relative:margin;v-text-anchor:middle" o:gfxdata="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" fillcolor="#00b050" strokecolor="white [3212]">
                       <v:stroke joinstyle="miter"/>
                     </v:oval>
                   </w:pict>
@@ -940,6 +984,7 @@
             </w:r>
             <w:r>
               <w:rPr>
+                <w:noProof/>
                 <w:color w:val="FFFFFF" w:themeColor="background1"/>
                 <w:sz w:val="32"/>
                 <w:szCs w:val="32"/>
@@ -947,7 +992,7 @@
               <mc:AlternateContent>
                 <mc:Choice Requires="wps">
                   <w:drawing>
-                    <wp:anchor distT="0" distB="0" distL="114300" distR="114300" simplePos="0" relativeHeight="251700224" behindDoc="0" locked="0" layoutInCell="1" allowOverlap="1" wp14:anchorId="7B697D34" wp14:editId="116B45E5">
+                    <wp:anchor distT="0" distB="0" distL="114300" distR="114300" simplePos="0" relativeHeight="251779072" behindDoc="0" locked="0" layoutInCell="1" allowOverlap="1" wp14:anchorId="7B697D34" wp14:editId="116B45E5">
                       <wp:simplePos x="0" y="0"/>
                       <wp:positionH relativeFrom="column">
                         <wp:posOffset>4662805</wp:posOffset>
@@ -1043,7 +1088,7 @@
                 </mc:Choice>
                 <mc:Fallback>
                   <w:pict>
-                    <v:rect w14:anchorId="7B697D34" id="_x0000_s1027" style="position:absolute;left:0;text-align:left;margin-left:367.15pt;margin-top:373.7pt;width:45.05pt;height:34.5pt;z-index:251700224;visibility:visible;mso-wrap-style:square;mso-width-percent:0;mso-height-percent:0;mso-wrap-distance-left:9pt;mso-wrap-distance-top:0;mso-wrap-distance-right:9pt;mso-wrap-distance-bottom:0;mso-position-horizontal:absolute;mso-position-horizontal-relative:text;mso-position-vertical:absolute;mso-position-vertical-relative:text;mso-width-percent:0;mso-height-percent:0;mso-width-relative:margin;mso-height-relative:margin;v-text-anchor:middle" o:gfxdata="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" fillcolor="black" strokecolor="red" strokeweight="1pt">
+                    <v:rect w14:anchorId="7B697D34" id="_x0000_s1027" style="position:absolute;left:0;text-align:left;margin-left:367.15pt;margin-top:373.7pt;width:45.05pt;height:34.5pt;z-index:251779072;visibility:visible;mso-wrap-style:square;mso-width-percent:0;mso-height-percent:0;mso-wrap-distance-left:9pt;mso-wrap-distance-top:0;mso-wrap-distance-right:9pt;mso-wrap-distance-bottom:0;mso-position-horizontal:absolute;mso-position-horizontal-relative:text;mso-position-vertical:absolute;mso-position-vertical-relative:text;mso-width-percent:0;mso-height-percent:0;mso-width-relative:margin;mso-height-relative:margin;v-text-anchor:middle" o:gfxdata="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" fillcolor="black" strokecolor="red" strokeweight="1pt">
                       <v:fill opacity="39321f"/>
                       <v:textbox inset="0,0,0,0">
                         <w:txbxContent>
@@ -1089,6 +1134,7 @@
             </w:r>
             <w:r>
               <w:rPr>
+                <w:noProof/>
                 <w:color w:val="FFFFFF" w:themeColor="background1"/>
                 <w:sz w:val="32"/>
                 <w:szCs w:val="32"/>
@@ -1096,7 +1142,7 @@
               <mc:AlternateContent>
                 <mc:Choice Requires="wps">
                   <w:drawing>
-                    <wp:anchor distT="0" distB="0" distL="114300" distR="114300" simplePos="0" relativeHeight="251722752" behindDoc="0" locked="0" layoutInCell="1" allowOverlap="1" wp14:anchorId="4A1BC4D0" wp14:editId="5A2C8BDA">
+                    <wp:anchor distT="0" distB="0" distL="114300" distR="114300" simplePos="0" relativeHeight="251790336" behindDoc="0" locked="0" layoutInCell="1" allowOverlap="1" wp14:anchorId="4A1BC4D0" wp14:editId="5A2C8BDA">
                       <wp:simplePos x="0" y="0"/>
                       <wp:positionH relativeFrom="column">
                         <wp:posOffset>3747688</wp:posOffset>
@@ -1166,7 +1212,7 @@
                 </mc:Choice>
                 <mc:Fallback>
                   <w:pict>
-                    <v:oval w14:anchorId="76E2D0BB" id="Oval 1" o:spid="_x0000_s1026" style="position:absolute;margin-left:295.1pt;margin-top:360.15pt;width:7.5pt;height:7.5pt;z-index:251722752;visibility:visible;mso-wrap-style:square;mso-width-percent:0;mso-height-percent:0;mso-wrap-distance-left:9pt;mso-wrap-distance-top:0;mso-wrap-distance-right:9pt;mso-wrap-distance-bottom:0;mso-position-horizontal:absolute;mso-position-horizontal-relative:text;mso-position-vertical:absolute;mso-position-vertical-relative:text;mso-width-percent:0;mso-height-percent:0;mso-width-relative:margin;mso-height-relative:margin;v-text-anchor:middle" o:gfxdata="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" fillcolor="#00b050" strokecolor="white [3212]">
+                    <v:oval w14:anchorId="5A4BF2E2" id="Oval 1" o:spid="_x0000_s1026" style="position:absolute;margin-left:295.1pt;margin-top:360.15pt;width:7.5pt;height:7.5pt;z-index:251790336;visibility:visible;mso-wrap-style:square;mso-width-percent:0;mso-height-percent:0;mso-wrap-distance-left:9pt;mso-wrap-distance-top:0;mso-wrap-distance-right:9pt;mso-wrap-distance-bottom:0;mso-position-horizontal:absolute;mso-position-horizontal-relative:text;mso-position-vertical:absolute;mso-position-vertical-relative:text;mso-width-percent:0;mso-height-percent:0;mso-width-relative:margin;mso-height-relative:margin;v-text-anchor:middle" o:gfxdata="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" fillcolor="#00b050" strokecolor="white [3212]">
                       <v:stroke joinstyle="miter"/>
                     </v:oval>
                   </w:pict>
@@ -1175,6 +1221,7 @@
             </w:r>
             <w:r>
               <w:rPr>
+                <w:noProof/>
                 <w:color w:val="FFFFFF" w:themeColor="background1"/>
                 <w:sz w:val="32"/>
                 <w:szCs w:val="32"/>
@@ -1182,7 +1229,7 @@
               <mc:AlternateContent>
                 <mc:Choice Requires="wps">
                   <w:drawing>
-                    <wp:anchor distT="0" distB="0" distL="114300" distR="114300" simplePos="0" relativeHeight="251686912" behindDoc="0" locked="0" layoutInCell="1" allowOverlap="1" wp14:anchorId="5A88F8DE" wp14:editId="3A4424E0">
+                    <wp:anchor distT="0" distB="0" distL="114300" distR="114300" simplePos="0" relativeHeight="251772928" behindDoc="0" locked="0" layoutInCell="1" allowOverlap="1" wp14:anchorId="5A88F8DE" wp14:editId="3A4424E0">
                       <wp:simplePos x="0" y="0"/>
                       <wp:positionH relativeFrom="column">
                         <wp:posOffset>3576320</wp:posOffset>
@@ -1282,20 +1329,6 @@
                                       </w14:shadow>
                                     </w:rPr>
                                     <w:br/>
-                                  </w:r>
-                                  <w:r>
-                                    <w:rPr>
-                                      <w:b/>
-                                      <w:bCs/>
-                                      <w:color w:val="FF0000"/>
-                                      <w:sz w:val="20"/>
-                                      <w:szCs w:val="20"/>
-                                      <w14:shadow w14:blurRad="50800" w14:dist="38100" w14:dir="2700000" w14:sx="100000" w14:sy="100000" w14:kx="0" w14:ky="0" w14:algn="tl">
-                                        <w14:srgbClr w14:val="000000">
-                                          <w14:alpha w14:val="60000"/>
-                                        </w14:srgbClr>
-                                      </w14:shadow>
-                                    </w:rPr>
                                     <w:t>back</w:t>
                                   </w:r>
                                 </w:p>
@@ -1321,7 +1354,7 @@
                 </mc:Choice>
                 <mc:Fallback>
                   <w:pict>
-                    <v:rect w14:anchorId="5A88F8DE" id="_x0000_s1028" style="position:absolute;left:0;text-align:left;margin-left:281.6pt;margin-top:327.65pt;width:36.85pt;height:25.5pt;z-index:251686912;visibility:visible;mso-wrap-style:square;mso-width-percent:0;mso-height-percent:0;mso-wrap-distance-left:9pt;mso-wrap-distance-top:0;mso-wrap-distance-right:9pt;mso-wrap-distance-bottom:0;mso-position-horizontal:absolute;mso-position-horizontal-relative:text;mso-position-vertical:absolute;mso-position-vertical-relative:text;mso-width-percent:0;mso-height-percent:0;mso-width-relative:margin;mso-height-relative:margin;v-text-anchor:middle" o:gfxdata="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" fillcolor="black" strokecolor="red" strokeweight="1pt">
+                    <v:rect w14:anchorId="5A88F8DE" id="_x0000_s1028" style="position:absolute;left:0;text-align:left;margin-left:281.6pt;margin-top:327.65pt;width:36.85pt;height:25.5pt;z-index:251772928;visibility:visible;mso-wrap-style:square;mso-width-percent:0;mso-height-percent:0;mso-wrap-distance-left:9pt;mso-wrap-distance-top:0;mso-wrap-distance-right:9pt;mso-wrap-distance-bottom:0;mso-position-horizontal:absolute;mso-position-horizontal-relative:text;mso-position-vertical:absolute;mso-position-vertical-relative:text;mso-width-percent:0;mso-height-percent:0;mso-width-relative:margin;mso-height-relative:margin;v-text-anchor:middle" o:gfxdata="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" fillcolor="black" strokecolor="red" strokeweight="1pt">
                       <v:fill opacity="39321f"/>
                       <v:textbox inset="0,0,0,0">
                         <w:txbxContent>
@@ -1371,20 +1404,6 @@
                                 </w14:shadow>
                               </w:rPr>
                               <w:br/>
-                            </w:r>
-                            <w:r>
-                              <w:rPr>
-                                <w:b/>
-                                <w:bCs/>
-                                <w:color w:val="FF0000"/>
-                                <w:sz w:val="20"/>
-                                <w:szCs w:val="20"/>
-                                <w14:shadow w14:blurRad="50800" w14:dist="38100" w14:dir="2700000" w14:sx="100000" w14:sy="100000" w14:kx="0" w14:ky="0" w14:algn="tl">
-                                  <w14:srgbClr w14:val="000000">
-                                    <w14:alpha w14:val="60000"/>
-                                  </w14:srgbClr>
-                                </w14:shadow>
-                              </w:rPr>
                               <w:t>back</w:t>
                             </w:r>
                           </w:p>
@@ -1397,6 +1416,7 @@
             </w:r>
             <w:r>
               <w:rPr>
+                <w:noProof/>
                 <w:color w:val="FFFFFF" w:themeColor="background1"/>
                 <w:sz w:val="32"/>
                 <w:szCs w:val="32"/>
@@ -1404,7 +1424,7 @@
               <mc:AlternateContent>
                 <mc:Choice Requires="wps">
                   <w:drawing>
-                    <wp:anchor distT="0" distB="0" distL="114300" distR="114300" simplePos="0" relativeHeight="251678720" behindDoc="0" locked="0" layoutInCell="1" allowOverlap="1" wp14:anchorId="71AA84E9" wp14:editId="24FDDE41">
+                    <wp:anchor distT="0" distB="0" distL="114300" distR="114300" simplePos="0" relativeHeight="251769856" behindDoc="0" locked="0" layoutInCell="1" allowOverlap="1" wp14:anchorId="71AA84E9" wp14:editId="24FDDE41">
                       <wp:simplePos x="0" y="0"/>
                       <wp:positionH relativeFrom="column">
                         <wp:posOffset>2567305</wp:posOffset>
@@ -1504,20 +1524,6 @@
                                       </w14:shadow>
                                     </w:rPr>
                                     <w:br/>
-                                  </w:r>
-                                  <w:r>
-                                    <w:rPr>
-                                      <w:b/>
-                                      <w:bCs/>
-                                      <w:color w:val="FF0000"/>
-                                      <w:sz w:val="20"/>
-                                      <w:szCs w:val="20"/>
-                                      <w14:shadow w14:blurRad="50800" w14:dist="38100" w14:dir="2700000" w14:sx="100000" w14:sy="100000" w14:kx="0" w14:ky="0" w14:algn="tl">
-                                        <w14:srgbClr w14:val="000000">
-                                          <w14:alpha w14:val="60000"/>
-                                        </w14:srgbClr>
-                                      </w14:shadow>
-                                    </w:rPr>
                                     <w:t>front</w:t>
                                   </w:r>
                                 </w:p>
@@ -1543,7 +1549,7 @@
                 </mc:Choice>
                 <mc:Fallback>
                   <w:pict>
-                    <v:rect w14:anchorId="71AA84E9" id="_x0000_s1029" style="position:absolute;left:0;text-align:left;margin-left:202.15pt;margin-top:327.65pt;width:36.85pt;height:25.5pt;z-index:251678720;visibility:visible;mso-wrap-style:square;mso-width-percent:0;mso-height-percent:0;mso-wrap-distance-left:9pt;mso-wrap-distance-top:0;mso-wrap-distance-right:9pt;mso-wrap-distance-bottom:0;mso-position-horizontal:absolute;mso-position-horizontal-relative:text;mso-position-vertical:absolute;mso-position-vertical-relative:text;mso-width-percent:0;mso-height-percent:0;mso-width-relative:margin;mso-height-relative:margin;v-text-anchor:middle" o:gfxdata="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" fillcolor="black" strokecolor="red" strokeweight="1pt">
+                    <v:rect w14:anchorId="71AA84E9" id="_x0000_s1029" style="position:absolute;left:0;text-align:left;margin-left:202.15pt;margin-top:327.65pt;width:36.85pt;height:25.5pt;z-index:251769856;visibility:visible;mso-wrap-style:square;mso-width-percent:0;mso-height-percent:0;mso-wrap-distance-left:9pt;mso-wrap-distance-top:0;mso-wrap-distance-right:9pt;mso-wrap-distance-bottom:0;mso-position-horizontal:absolute;mso-position-horizontal-relative:text;mso-position-vertical:absolute;mso-position-vertical-relative:text;mso-width-percent:0;mso-height-percent:0;mso-width-relative:margin;mso-height-relative:margin;v-text-anchor:middle" o:gfxdata="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" fillcolor="black" strokecolor="red" strokeweight="1pt">
                       <v:fill opacity="39321f"/>
                       <v:textbox inset="0,0,0,0">
                         <w:txbxContent>
@@ -1593,20 +1599,6 @@
                                 </w14:shadow>
                               </w:rPr>
                               <w:br/>
-                            </w:r>
-                            <w:r>
-                              <w:rPr>
-                                <w:b/>
-                                <w:bCs/>
-                                <w:color w:val="FF0000"/>
-                                <w:sz w:val="20"/>
-                                <w:szCs w:val="20"/>
-                                <w14:shadow w14:blurRad="50800" w14:dist="38100" w14:dir="2700000" w14:sx="100000" w14:sy="100000" w14:kx="0" w14:ky="0" w14:algn="tl">
-                                  <w14:srgbClr w14:val="000000">
-                                    <w14:alpha w14:val="60000"/>
-                                  </w14:srgbClr>
-                                </w14:shadow>
-                              </w:rPr>
                               <w:t>front</w:t>
                             </w:r>
                           </w:p>
@@ -1619,6 +1611,7 @@
             </w:r>
             <w:r>
               <w:rPr>
+                <w:noProof/>
                 <w:color w:val="FFFFFF" w:themeColor="background1"/>
                 <w:sz w:val="32"/>
                 <w:szCs w:val="32"/>
@@ -1626,7 +1619,7 @@
               <mc:AlternateContent>
                 <mc:Choice Requires="wps">
                   <w:drawing>
-                    <wp:anchor distT="0" distB="0" distL="114300" distR="114300" simplePos="0" relativeHeight="251720704" behindDoc="0" locked="0" layoutInCell="1" allowOverlap="1" wp14:anchorId="55090AFE" wp14:editId="1DC7B450">
+                    <wp:anchor distT="0" distB="0" distL="114300" distR="114300" simplePos="0" relativeHeight="251789312" behindDoc="0" locked="0" layoutInCell="1" allowOverlap="1" wp14:anchorId="55090AFE" wp14:editId="1DC7B450">
                       <wp:simplePos x="0" y="0"/>
                       <wp:positionH relativeFrom="column">
                         <wp:posOffset>2739390</wp:posOffset>
@@ -1696,7 +1689,7 @@
                 </mc:Choice>
                 <mc:Fallback>
                   <w:pict>
-                    <v:oval w14:anchorId="04E739F8" id="Oval 1" o:spid="_x0000_s1026" style="position:absolute;margin-left:215.7pt;margin-top:359.95pt;width:7.5pt;height:7.5pt;z-index:251720704;visibility:visible;mso-wrap-style:square;mso-width-percent:0;mso-height-percent:0;mso-wrap-distance-left:9pt;mso-wrap-distance-top:0;mso-wrap-distance-right:9pt;mso-wrap-distance-bottom:0;mso-position-horizontal:absolute;mso-position-horizontal-relative:text;mso-position-vertical:absolute;mso-position-vertical-relative:text;mso-width-percent:0;mso-height-percent:0;mso-width-relative:margin;mso-height-relative:margin;v-text-anchor:middle" o:gfxdata="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" fillcolor="#00b050" strokecolor="white [3212]">
+                    <v:oval w14:anchorId="1CE78DC3" id="Oval 1" o:spid="_x0000_s1026" style="position:absolute;margin-left:215.7pt;margin-top:359.95pt;width:7.5pt;height:7.5pt;z-index:251789312;visibility:visible;mso-wrap-style:square;mso-width-percent:0;mso-height-percent:0;mso-wrap-distance-left:9pt;mso-wrap-distance-top:0;mso-wrap-distance-right:9pt;mso-wrap-distance-bottom:0;mso-position-horizontal:absolute;mso-position-horizontal-relative:text;mso-position-vertical:absolute;mso-position-vertical-relative:text;mso-width-percent:0;mso-height-percent:0;mso-width-relative:margin;mso-height-relative:margin;v-text-anchor:middle" o:gfxdata="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" fillcolor="#00b050" strokecolor="white [3212]">
                       <v:stroke joinstyle="miter"/>
                     </v:oval>
                   </w:pict>
@@ -1705,6 +1698,7 @@
             </w:r>
             <w:r>
               <w:rPr>
+                <w:noProof/>
                 <w:color w:val="FFFFFF" w:themeColor="background1"/>
                 <w:sz w:val="32"/>
                 <w:szCs w:val="32"/>
@@ -1712,7 +1706,7 @@
               <mc:AlternateContent>
                 <mc:Choice Requires="wps">
                   <w:drawing>
-                    <wp:anchor distT="0" distB="0" distL="114300" distR="114300" simplePos="0" relativeHeight="251718656" behindDoc="0" locked="0" layoutInCell="1" allowOverlap="1" wp14:anchorId="7BDD0774" wp14:editId="115D10A5">
+                    <wp:anchor distT="0" distB="0" distL="114300" distR="114300" simplePos="0" relativeHeight="251788288" behindDoc="0" locked="0" layoutInCell="1" allowOverlap="1" wp14:anchorId="7BDD0774" wp14:editId="115D10A5">
                       <wp:simplePos x="0" y="0"/>
                       <wp:positionH relativeFrom="column">
                         <wp:posOffset>1593850</wp:posOffset>
@@ -1782,7 +1776,7 @@
                 </mc:Choice>
                 <mc:Fallback>
                   <w:pict>
-                    <v:oval w14:anchorId="3454A166" id="Oval 1" o:spid="_x0000_s1026" style="position:absolute;margin-left:125.5pt;margin-top:348.25pt;width:7.5pt;height:7.5pt;z-index:251718656;visibility:visible;mso-wrap-style:square;mso-width-percent:0;mso-height-percent:0;mso-wrap-distance-left:9pt;mso-wrap-distance-top:0;mso-wrap-distance-right:9pt;mso-wrap-distance-bottom:0;mso-position-horizontal:absolute;mso-position-horizontal-relative:text;mso-position-vertical:absolute;mso-position-vertical-relative:text;mso-width-percent:0;mso-height-percent:0;mso-width-relative:margin;mso-height-relative:margin;v-text-anchor:middle" o:gfxdata="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" fillcolor="#00b050" strokecolor="white [3212]">
+                    <v:oval w14:anchorId="48D9D700" id="Oval 1" o:spid="_x0000_s1026" style="position:absolute;margin-left:125.5pt;margin-top:348.25pt;width:7.5pt;height:7.5pt;z-index:251788288;visibility:visible;mso-wrap-style:square;mso-width-percent:0;mso-height-percent:0;mso-wrap-distance-left:9pt;mso-wrap-distance-top:0;mso-wrap-distance-right:9pt;mso-wrap-distance-bottom:0;mso-position-horizontal:absolute;mso-position-horizontal-relative:text;mso-position-vertical:absolute;mso-position-vertical-relative:text;mso-width-percent:0;mso-height-percent:0;mso-width-relative:margin;mso-height-relative:margin;v-text-anchor:middle" o:gfxdata="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" fillcolor="#00b050" strokecolor="white [3212]">
                       <v:stroke joinstyle="miter"/>
                     </v:oval>
                   </w:pict>
@@ -1791,6 +1785,7 @@
             </w:r>
             <w:r>
               <w:rPr>
+                <w:noProof/>
                 <w:color w:val="FFFFFF" w:themeColor="background1"/>
                 <w:sz w:val="32"/>
                 <w:szCs w:val="32"/>
@@ -1798,7 +1793,7 @@
               <mc:AlternateContent>
                 <mc:Choice Requires="wps">
                   <w:drawing>
-                    <wp:anchor distT="0" distB="0" distL="114300" distR="114300" simplePos="0" relativeHeight="251716608" behindDoc="0" locked="0" layoutInCell="1" allowOverlap="1" wp14:anchorId="13CFE972" wp14:editId="44161C19">
+                    <wp:anchor distT="0" distB="0" distL="114300" distR="114300" simplePos="0" relativeHeight="251787264" behindDoc="0" locked="0" layoutInCell="1" allowOverlap="1" wp14:anchorId="13CFE972" wp14:editId="44161C19">
                       <wp:simplePos x="0" y="0"/>
                       <wp:positionH relativeFrom="column">
                         <wp:posOffset>1368413</wp:posOffset>
@@ -1868,7 +1863,7 @@
                 </mc:Choice>
                 <mc:Fallback>
                   <w:pict>
-                    <v:oval w14:anchorId="28FB09AC" id="Oval 1" o:spid="_x0000_s1026" style="position:absolute;margin-left:107.75pt;margin-top:403pt;width:7.5pt;height:7.5pt;z-index:251716608;visibility:visible;mso-wrap-style:square;mso-width-percent:0;mso-height-percent:0;mso-wrap-distance-left:9pt;mso-wrap-distance-top:0;mso-wrap-distance-right:9pt;mso-wrap-distance-bottom:0;mso-position-horizontal:absolute;mso-position-horizontal-relative:text;mso-position-vertical:absolute;mso-position-vertical-relative:text;mso-width-percent:0;mso-height-percent:0;mso-width-relative:margin;mso-height-relative:margin;v-text-anchor:middle" o:gfxdata="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" fillcolor="#00b050" strokecolor="white [3212]">
+                    <v:oval w14:anchorId="0B03097D" id="Oval 1" o:spid="_x0000_s1026" style="position:absolute;margin-left:107.75pt;margin-top:403pt;width:7.5pt;height:7.5pt;z-index:251787264;visibility:visible;mso-wrap-style:square;mso-width-percent:0;mso-height-percent:0;mso-wrap-distance-left:9pt;mso-wrap-distance-top:0;mso-wrap-distance-right:9pt;mso-wrap-distance-bottom:0;mso-position-horizontal:absolute;mso-position-horizontal-relative:text;mso-position-vertical:absolute;mso-position-vertical-relative:text;mso-width-percent:0;mso-height-percent:0;mso-width-relative:margin;mso-height-relative:margin;v-text-anchor:middle" o:gfxdata="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" fillcolor="#00b050" strokecolor="white [3212]">
                       <v:stroke joinstyle="miter"/>
                     </v:oval>
                   </w:pict>
@@ -1877,6 +1872,7 @@
             </w:r>
             <w:r>
               <w:rPr>
+                <w:noProof/>
                 <w:color w:val="FFFFFF" w:themeColor="background1"/>
                 <w:sz w:val="32"/>
                 <w:szCs w:val="32"/>
@@ -1884,7 +1880,7 @@
               <mc:AlternateContent>
                 <mc:Choice Requires="wps">
                   <w:drawing>
-                    <wp:anchor distT="0" distB="0" distL="114300" distR="114300" simplePos="0" relativeHeight="251698176" behindDoc="0" locked="0" layoutInCell="1" allowOverlap="1" wp14:anchorId="0A5CB297" wp14:editId="5A8F7352">
+                    <wp:anchor distT="0" distB="0" distL="114300" distR="114300" simplePos="0" relativeHeight="251778048" behindDoc="0" locked="0" layoutInCell="1" allowOverlap="1" wp14:anchorId="0A5CB297" wp14:editId="5A8F7352">
                       <wp:simplePos x="0" y="0"/>
                       <wp:positionH relativeFrom="column">
                         <wp:posOffset>2867765</wp:posOffset>
@@ -1986,6 +1982,7 @@
                                     <w:br/>
                                     <w:t>←</w:t>
                                   </w:r>
+                                  <w:proofErr w:type="gramStart"/>
                                   <w:r>
                                     <w:rPr>
                                       <w:b/>
@@ -1999,8 +1996,9 @@
                                         </w14:srgbClr>
                                       </w14:shadow>
                                     </w:rPr>
-                                    <w:t>reset</w:t>
+                                    <w:t>reset  I</w:t>
                                   </w:r>
+                                  <w:proofErr w:type="gramEnd"/>
                                   <w:r>
                                     <w:rPr>
                                       <w:b/>
@@ -2014,37 +2012,7 @@
                                         </w14:srgbClr>
                                       </w14:shadow>
                                     </w:rPr>
-                                    <w:t xml:space="preserve">  </w:t>
-                                  </w:r>
-                                  <w:r>
-                                    <w:rPr>
-                                      <w:b/>
-                                      <w:bCs/>
-                                      <w:color w:val="FF0000"/>
-                                      <w:sz w:val="20"/>
-                                      <w:szCs w:val="20"/>
-                                      <w14:shadow w14:blurRad="50800" w14:dist="38100" w14:dir="2700000" w14:sx="100000" w14:sy="100000" w14:kx="0" w14:ky="0" w14:algn="tl">
-                                        <w14:srgbClr w14:val="000000">
-                                          <w14:alpha w14:val="60000"/>
-                                        </w14:srgbClr>
-                                      </w14:shadow>
-                                    </w:rPr>
-                                    <w:t>I/O</w:t>
-                                  </w:r>
-                                  <w:r>
-                                    <w:rPr>
-                                      <w:b/>
-                                      <w:bCs/>
-                                      <w:color w:val="FF0000"/>
-                                      <w:sz w:val="20"/>
-                                      <w:szCs w:val="20"/>
-                                      <w14:shadow w14:blurRad="50800" w14:dist="38100" w14:dir="2700000" w14:sx="100000" w14:sy="100000" w14:kx="0" w14:ky="0" w14:algn="tl">
-                                        <w14:srgbClr w14:val="000000">
-                                          <w14:alpha w14:val="60000"/>
-                                        </w14:srgbClr>
-                                      </w14:shadow>
-                                    </w:rPr>
-                                    <w:t>→</w:t>
+                                    <w:t>/O→</w:t>
                                   </w:r>
                                 </w:p>
                               </w:txbxContent>
@@ -2069,7 +2037,7 @@
                 </mc:Choice>
                 <mc:Fallback>
                   <w:pict>
-                    <v:rect w14:anchorId="0A5CB297" id="_x0000_s1030" style="position:absolute;left:0;text-align:left;margin-left:225.8pt;margin-top:414.3pt;width:67.15pt;height:25.5pt;z-index:251698176;visibility:visible;mso-wrap-style:square;mso-width-percent:0;mso-height-percent:0;mso-wrap-distance-left:9pt;mso-wrap-distance-top:0;mso-wrap-distance-right:9pt;mso-wrap-distance-bottom:0;mso-position-horizontal:absolute;mso-position-horizontal-relative:text;mso-position-vertical:absolute;mso-position-vertical-relative:text;mso-width-percent:0;mso-height-percent:0;mso-width-relative:margin;mso-height-relative:margin;v-text-anchor:middle" o:gfxdata="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" fillcolor="black" strokecolor="red" strokeweight="1pt">
+                    <v:rect w14:anchorId="0A5CB297" id="_x0000_s1030" style="position:absolute;left:0;text-align:left;margin-left:225.8pt;margin-top:414.3pt;width:67.15pt;height:25.5pt;z-index:251778048;visibility:visible;mso-wrap-style:square;mso-width-percent:0;mso-height-percent:0;mso-wrap-distance-left:9pt;mso-wrap-distance-top:0;mso-wrap-distance-right:9pt;mso-wrap-distance-bottom:0;mso-position-horizontal:absolute;mso-position-horizontal-relative:text;mso-position-vertical:absolute;mso-position-vertical-relative:text;mso-width-percent:0;mso-height-percent:0;mso-width-relative:margin;mso-height-relative:margin;v-text-anchor:middle" o:gfxdata="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" fillcolor="black" strokecolor="red" strokeweight="1pt">
                       <v:fill opacity="39321f"/>
                       <v:textbox inset="0,0,0,0">
                         <w:txbxContent>
@@ -2121,6 +2089,7 @@
                               <w:br/>
                               <w:t>←</w:t>
                             </w:r>
+                            <w:proofErr w:type="gramStart"/>
                             <w:r>
                               <w:rPr>
                                 <w:b/>
@@ -2134,8 +2103,9 @@
                                   </w14:srgbClr>
                                 </w14:shadow>
                               </w:rPr>
-                              <w:t>reset</w:t>
+                              <w:t>reset  I</w:t>
                             </w:r>
+                            <w:proofErr w:type="gramEnd"/>
                             <w:r>
                               <w:rPr>
                                 <w:b/>
@@ -2149,37 +2119,7 @@
                                   </w14:srgbClr>
                                 </w14:shadow>
                               </w:rPr>
-                              <w:t xml:space="preserve">  </w:t>
-                            </w:r>
-                            <w:r>
-                              <w:rPr>
-                                <w:b/>
-                                <w:bCs/>
-                                <w:color w:val="FF0000"/>
-                                <w:sz w:val="20"/>
-                                <w:szCs w:val="20"/>
-                                <w14:shadow w14:blurRad="50800" w14:dist="38100" w14:dir="2700000" w14:sx="100000" w14:sy="100000" w14:kx="0" w14:ky="0" w14:algn="tl">
-                                  <w14:srgbClr w14:val="000000">
-                                    <w14:alpha w14:val="60000"/>
-                                  </w14:srgbClr>
-                                </w14:shadow>
-                              </w:rPr>
-                              <w:t>I/O</w:t>
-                            </w:r>
-                            <w:r>
-                              <w:rPr>
-                                <w:b/>
-                                <w:bCs/>
-                                <w:color w:val="FF0000"/>
-                                <w:sz w:val="20"/>
-                                <w:szCs w:val="20"/>
-                                <w14:shadow w14:blurRad="50800" w14:dist="38100" w14:dir="2700000" w14:sx="100000" w14:sy="100000" w14:kx="0" w14:ky="0" w14:algn="tl">
-                                  <w14:srgbClr w14:val="000000">
-                                    <w14:alpha w14:val="60000"/>
-                                  </w14:srgbClr>
-                                </w14:shadow>
-                              </w:rPr>
-                              <w:t>→</w:t>
+                              <w:t>/O→</w:t>
                             </w:r>
                           </w:p>
                         </w:txbxContent>
@@ -2191,6 +2131,7 @@
             </w:r>
             <w:r>
               <w:rPr>
+                <w:noProof/>
                 <w:color w:val="FFFFFF" w:themeColor="background1"/>
                 <w:sz w:val="32"/>
                 <w:szCs w:val="32"/>
@@ -2198,7 +2139,7 @@
               <mc:AlternateContent>
                 <mc:Choice Requires="wps">
                   <w:drawing>
-                    <wp:anchor distT="0" distB="0" distL="114300" distR="114300" simplePos="0" relativeHeight="251714560" behindDoc="0" locked="0" layoutInCell="1" allowOverlap="1" wp14:anchorId="712FD206" wp14:editId="16A3B9A1">
+                    <wp:anchor distT="0" distB="0" distL="114300" distR="114300" simplePos="0" relativeHeight="251786240" behindDoc="0" locked="0" layoutInCell="1" allowOverlap="1" wp14:anchorId="712FD206" wp14:editId="16A3B9A1">
                       <wp:simplePos x="0" y="0"/>
                       <wp:positionH relativeFrom="column">
                         <wp:posOffset>4343540</wp:posOffset>
@@ -2259,7 +2200,7 @@
                 </mc:Choice>
                 <mc:Fallback>
                   <w:pict>
-                    <v:shape w14:anchorId="7BE05A4A" id="Straight Arrow Connector 2" o:spid="_x0000_s1026" type="#_x0000_t32" style="position:absolute;margin-left:342pt;margin-top:143.1pt;width:13.25pt;height:50.45pt;flip:x y;z-index:251714560;visibility:visible;mso-wrap-style:square;mso-width-percent:0;mso-height-percent:0;mso-wrap-distance-left:9pt;mso-wrap-distance-top:0;mso-wrap-distance-right:9pt;mso-wrap-distance-bottom:0;mso-position-horizontal:absolute;mso-position-horizontal-relative:text;mso-position-vertical:absolute;mso-position-vertical-relative:text;mso-width-percent:0;mso-height-percent:0;mso-width-relative:margin;mso-height-relative:margin" o:gfxdata="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" strokecolor="red" strokeweight="1.5pt">
+                    <v:shape w14:anchorId="72A1C903" id="Straight Arrow Connector 2" o:spid="_x0000_s1026" type="#_x0000_t32" style="position:absolute;margin-left:342pt;margin-top:143.1pt;width:13.25pt;height:50.45pt;flip:x y;z-index:251786240;visibility:visible;mso-wrap-style:square;mso-width-percent:0;mso-height-percent:0;mso-wrap-distance-left:9pt;mso-wrap-distance-top:0;mso-wrap-distance-right:9pt;mso-wrap-distance-bottom:0;mso-position-horizontal:absolute;mso-position-horizontal-relative:text;mso-position-vertical:absolute;mso-position-vertical-relative:text;mso-width-percent:0;mso-height-percent:0;mso-width-relative:margin;mso-height-relative:margin" o:gfxdata="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" strokecolor="red" strokeweight="1.5pt">
                       <v:stroke endarrow="block" joinstyle="miter"/>
                     </v:shape>
                   </w:pict>
@@ -2268,6 +2209,7 @@
             </w:r>
             <w:r>
               <w:rPr>
+                <w:noProof/>
                 <w:color w:val="FFFFFF" w:themeColor="background1"/>
                 <w:sz w:val="32"/>
                 <w:szCs w:val="32"/>
@@ -2275,7 +2217,7 @@
               <mc:AlternateContent>
                 <mc:Choice Requires="wps">
                   <w:drawing>
-                    <wp:anchor distT="0" distB="0" distL="114300" distR="114300" simplePos="0" relativeHeight="251713536" behindDoc="0" locked="0" layoutInCell="1" allowOverlap="1" wp14:anchorId="39E72E33" wp14:editId="221521B1">
+                    <wp:anchor distT="0" distB="0" distL="114300" distR="114300" simplePos="0" relativeHeight="251785216" behindDoc="0" locked="0" layoutInCell="1" allowOverlap="1" wp14:anchorId="39E72E33" wp14:editId="221521B1">
                       <wp:simplePos x="0" y="0"/>
                       <wp:positionH relativeFrom="column">
                         <wp:posOffset>4164026</wp:posOffset>
@@ -2359,22 +2301,7 @@
                                         </w14:srgbClr>
                                       </w14:shadow>
                                     </w:rPr>
-                                    <w:t xml:space="preserve">Horn </w:t>
-                                  </w:r>
-                                  <w:r>
-                                    <w:rPr>
-                                      <w:b/>
-                                      <w:bCs/>
-                                      <w:color w:val="FF0000"/>
-                                      <w:sz w:val="20"/>
-                                      <w:szCs w:val="20"/>
-                                      <w14:shadow w14:blurRad="50800" w14:dist="38100" w14:dir="2700000" w14:sx="100000" w14:sy="100000" w14:kx="0" w14:ky="0" w14:algn="tl">
-                                        <w14:srgbClr w14:val="000000">
-                                          <w14:alpha w14:val="60000"/>
-                                        </w14:srgbClr>
-                                      </w14:shadow>
-                                    </w:rPr>
-                                    <w:t>high</w:t>
+                                    <w:t>Horn high</w:t>
                                   </w:r>
                                 </w:p>
                               </w:txbxContent>
@@ -2399,7 +2326,7 @@
                 </mc:Choice>
                 <mc:Fallback>
                   <w:pict>
-                    <v:rect w14:anchorId="39E72E33" id="_x0000_s1031" style="position:absolute;left:0;text-align:left;margin-left:327.9pt;margin-top:193.9pt;width:53.9pt;height:17pt;z-index:251713536;visibility:visible;mso-wrap-style:square;mso-width-percent:0;mso-height-percent:0;mso-wrap-distance-left:9pt;mso-wrap-distance-top:0;mso-wrap-distance-right:9pt;mso-wrap-distance-bottom:0;mso-position-horizontal:absolute;mso-position-horizontal-relative:text;mso-position-vertical:absolute;mso-position-vertical-relative:text;mso-width-percent:0;mso-height-percent:0;mso-width-relative:margin;mso-height-relative:margin;v-text-anchor:middle" o:gfxdata="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" fillcolor="black" strokecolor="red" strokeweight="1pt">
+                    <v:rect w14:anchorId="39E72E33" id="_x0000_s1031" style="position:absolute;left:0;text-align:left;margin-left:327.9pt;margin-top:193.9pt;width:53.9pt;height:17pt;z-index:251785216;visibility:visible;mso-wrap-style:square;mso-width-percent:0;mso-height-percent:0;mso-wrap-distance-left:9pt;mso-wrap-distance-top:0;mso-wrap-distance-right:9pt;mso-wrap-distance-bottom:0;mso-position-horizontal:absolute;mso-position-horizontal-relative:text;mso-position-vertical:absolute;mso-position-vertical-relative:text;mso-width-percent:0;mso-height-percent:0;mso-width-relative:margin;mso-height-relative:margin;v-text-anchor:middle" o:gfxdata="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" fillcolor="black" strokecolor="red" strokeweight="1pt">
                       <v:fill opacity="39321f"/>
                       <v:textbox inset="0,0,0,0">
                         <w:txbxContent>
@@ -2433,22 +2360,7 @@
                                   </w14:srgbClr>
                                 </w14:shadow>
                               </w:rPr>
-                              <w:t xml:space="preserve">Horn </w:t>
-                            </w:r>
-                            <w:r>
-                              <w:rPr>
-                                <w:b/>
-                                <w:bCs/>
-                                <w:color w:val="FF0000"/>
-                                <w:sz w:val="20"/>
-                                <w:szCs w:val="20"/>
-                                <w14:shadow w14:blurRad="50800" w14:dist="38100" w14:dir="2700000" w14:sx="100000" w14:sy="100000" w14:kx="0" w14:ky="0" w14:algn="tl">
-                                  <w14:srgbClr w14:val="000000">
-                                    <w14:alpha w14:val="60000"/>
-                                  </w14:srgbClr>
-                                </w14:shadow>
-                              </w:rPr>
-                              <w:t>high</w:t>
+                              <w:t>Horn high</w:t>
                             </w:r>
                           </w:p>
                         </w:txbxContent>
@@ -2460,6 +2372,7 @@
             </w:r>
             <w:r>
               <w:rPr>
+                <w:noProof/>
                 <w:color w:val="FFFFFF" w:themeColor="background1"/>
                 <w:sz w:val="32"/>
                 <w:szCs w:val="32"/>
@@ -2467,7 +2380,7 @@
               <mc:AlternateContent>
                 <mc:Choice Requires="wps">
                   <w:drawing>
-                    <wp:anchor distT="0" distB="0" distL="114300" distR="114300" simplePos="0" relativeHeight="251669504" behindDoc="0" locked="0" layoutInCell="1" allowOverlap="1" wp14:anchorId="0B986780" wp14:editId="1FBA52BA">
+                    <wp:anchor distT="0" distB="0" distL="114300" distR="114300" simplePos="0" relativeHeight="251764736" behindDoc="0" locked="0" layoutInCell="1" allowOverlap="1" wp14:anchorId="0B986780" wp14:editId="1FBA52BA">
                       <wp:simplePos x="0" y="0"/>
                       <wp:positionH relativeFrom="column">
                         <wp:posOffset>1351280</wp:posOffset>
@@ -2576,7 +2489,7 @@
                 </mc:Choice>
                 <mc:Fallback>
                   <w:pict>
-                    <v:rect w14:anchorId="0B986780" id="_x0000_s1032" style="position:absolute;left:0;text-align:left;margin-left:106.4pt;margin-top:134.9pt;width:48.15pt;height:17pt;z-index:251669504;visibility:visible;mso-wrap-style:square;mso-width-percent:0;mso-height-percent:0;mso-wrap-distance-left:9pt;mso-wrap-distance-top:0;mso-wrap-distance-right:9pt;mso-wrap-distance-bottom:0;mso-position-horizontal:absolute;mso-position-horizontal-relative:text;mso-position-vertical:absolute;mso-position-vertical-relative:text;mso-width-percent:0;mso-height-percent:0;mso-width-relative:margin;mso-height-relative:margin;v-text-anchor:middle" o:gfxdata="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" fillcolor="black" strokecolor="red" strokeweight="1pt">
+                    <v:rect w14:anchorId="0B986780" id="_x0000_s1032" style="position:absolute;left:0;text-align:left;margin-left:106.4pt;margin-top:134.9pt;width:48.15pt;height:17pt;z-index:251764736;visibility:visible;mso-wrap-style:square;mso-width-percent:0;mso-height-percent:0;mso-wrap-distance-left:9pt;mso-wrap-distance-top:0;mso-wrap-distance-right:9pt;mso-wrap-distance-bottom:0;mso-position-horizontal:absolute;mso-position-horizontal-relative:text;mso-position-vertical:absolute;mso-position-vertical-relative:text;mso-width-percent:0;mso-height-percent:0;mso-width-relative:margin;mso-height-relative:margin;v-text-anchor:middle" o:gfxdata="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" fillcolor="black" strokecolor="red" strokeweight="1pt">
                       <v:fill opacity="39321f"/>
                       <v:textbox inset="0,0,0,0">
                         <w:txbxContent>
@@ -2622,6 +2535,7 @@
             </w:r>
             <w:r>
               <w:rPr>
+                <w:noProof/>
                 <w:color w:val="FFFFFF" w:themeColor="background1"/>
                 <w:sz w:val="32"/>
                 <w:szCs w:val="32"/>
@@ -2629,7 +2543,7 @@
               <mc:AlternateContent>
                 <mc:Choice Requires="wps">
                   <w:drawing>
-                    <wp:anchor distT="0" distB="0" distL="114300" distR="114300" simplePos="0" relativeHeight="251671552" behindDoc="0" locked="0" layoutInCell="1" allowOverlap="1" wp14:anchorId="39CCF745" wp14:editId="4A0471BA">
+                    <wp:anchor distT="0" distB="0" distL="114300" distR="114300" simplePos="0" relativeHeight="251765760" behindDoc="0" locked="0" layoutInCell="1" allowOverlap="1" wp14:anchorId="39CCF745" wp14:editId="4A0471BA">
                       <wp:simplePos x="0" y="0"/>
                       <wp:positionH relativeFrom="column">
                         <wp:posOffset>2514600</wp:posOffset>
@@ -2725,7 +2639,7 @@
                 </mc:Choice>
                 <mc:Fallback>
                   <w:pict>
-                    <v:rect w14:anchorId="39CCF745" id="_x0000_s1033" style="position:absolute;left:0;text-align:left;margin-left:198pt;margin-top:134.9pt;width:48.15pt;height:17pt;z-index:251671552;visibility:visible;mso-wrap-style:square;mso-width-percent:0;mso-height-percent:0;mso-wrap-distance-left:9pt;mso-wrap-distance-top:0;mso-wrap-distance-right:9pt;mso-wrap-distance-bottom:0;mso-position-horizontal:absolute;mso-position-horizontal-relative:text;mso-position-vertical:absolute;mso-position-vertical-relative:text;mso-width-percent:0;mso-height-percent:0;mso-width-relative:margin;mso-height-relative:margin;v-text-anchor:middle" o:gfxdata="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" fillcolor="black" strokecolor="red" strokeweight="1pt">
+                    <v:rect w14:anchorId="39CCF745" id="_x0000_s1033" style="position:absolute;left:0;text-align:left;margin-left:198pt;margin-top:134.9pt;width:48.15pt;height:17pt;z-index:251765760;visibility:visible;mso-wrap-style:square;mso-width-percent:0;mso-height-percent:0;mso-wrap-distance-left:9pt;mso-wrap-distance-top:0;mso-wrap-distance-right:9pt;mso-wrap-distance-bottom:0;mso-position-horizontal:absolute;mso-position-horizontal-relative:text;mso-position-vertical:absolute;mso-position-vertical-relative:text;mso-width-percent:0;mso-height-percent:0;mso-width-relative:margin;mso-height-relative:margin;v-text-anchor:middle" o:gfxdata="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" fillcolor="black" strokecolor="red" strokeweight="1pt">
                       <v:fill opacity="39321f"/>
                       <v:textbox inset="0,0,0,0">
                         <w:txbxContent>
@@ -2771,6 +2685,7 @@
             </w:r>
             <w:r>
               <w:rPr>
+                <w:noProof/>
                 <w:color w:val="FFFFFF" w:themeColor="background1"/>
                 <w:sz w:val="32"/>
                 <w:szCs w:val="32"/>
@@ -2778,7 +2693,7 @@
               <mc:AlternateContent>
                 <mc:Choice Requires="wps">
                   <w:drawing>
-                    <wp:anchor distT="0" distB="0" distL="114300" distR="114300" simplePos="0" relativeHeight="251673600" behindDoc="0" locked="0" layoutInCell="1" allowOverlap="1" wp14:anchorId="6F9D1902" wp14:editId="278BC357">
+                    <wp:anchor distT="0" distB="0" distL="114300" distR="114300" simplePos="0" relativeHeight="251766784" behindDoc="0" locked="0" layoutInCell="1" allowOverlap="1" wp14:anchorId="6F9D1902" wp14:editId="278BC357">
                       <wp:simplePos x="0" y="0"/>
                       <wp:positionH relativeFrom="column">
                         <wp:posOffset>3553460</wp:posOffset>
@@ -2874,7 +2789,7 @@
                 </mc:Choice>
                 <mc:Fallback>
                   <w:pict>
-                    <v:rect w14:anchorId="6F9D1902" id="_x0000_s1034" style="position:absolute;left:0;text-align:left;margin-left:279.8pt;margin-top:134.95pt;width:48.15pt;height:17pt;z-index:251673600;visibility:visible;mso-wrap-style:square;mso-width-percent:0;mso-height-percent:0;mso-wrap-distance-left:9pt;mso-wrap-distance-top:0;mso-wrap-distance-right:9pt;mso-wrap-distance-bottom:0;mso-position-horizontal:absolute;mso-position-horizontal-relative:text;mso-position-vertical:absolute;mso-position-vertical-relative:text;mso-width-percent:0;mso-height-percent:0;mso-width-relative:margin;mso-height-relative:margin;v-text-anchor:middle" o:gfxdata="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" fillcolor="black" strokecolor="red" strokeweight="1pt">
+                    <v:rect w14:anchorId="6F9D1902" id="_x0000_s1034" style="position:absolute;left:0;text-align:left;margin-left:279.8pt;margin-top:134.95pt;width:48.15pt;height:17pt;z-index:251766784;visibility:visible;mso-wrap-style:square;mso-width-percent:0;mso-height-percent:0;mso-wrap-distance-left:9pt;mso-wrap-distance-top:0;mso-wrap-distance-right:9pt;mso-wrap-distance-bottom:0;mso-position-horizontal:absolute;mso-position-horizontal-relative:text;mso-position-vertical:absolute;mso-position-vertical-relative:text;mso-width-percent:0;mso-height-percent:0;mso-width-relative:margin;mso-height-relative:margin;v-text-anchor:middle" o:gfxdata="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" fillcolor="black" strokecolor="red" strokeweight="1pt">
                       <v:fill opacity="39321f"/>
                       <v:textbox inset="0,0,0,0">
                         <w:txbxContent>
@@ -2920,6 +2835,7 @@
             </w:r>
             <w:r>
               <w:rPr>
+                <w:noProof/>
                 <w:color w:val="FFFFFF" w:themeColor="background1"/>
                 <w:sz w:val="32"/>
                 <w:szCs w:val="32"/>
@@ -2927,7 +2843,7 @@
               <mc:AlternateContent>
                 <mc:Choice Requires="wps">
                   <w:drawing>
-                    <wp:anchor distT="0" distB="0" distL="114300" distR="114300" simplePos="0" relativeHeight="251702272" behindDoc="0" locked="0" layoutInCell="1" allowOverlap="1" wp14:anchorId="1043F54F" wp14:editId="37D1A11F">
+                    <wp:anchor distT="0" distB="0" distL="114300" distR="114300" simplePos="0" relativeHeight="251780096" behindDoc="0" locked="0" layoutInCell="1" allowOverlap="1" wp14:anchorId="1043F54F" wp14:editId="37D1A11F">
                       <wp:simplePos x="0" y="0"/>
                       <wp:positionH relativeFrom="column">
                         <wp:posOffset>4691349</wp:posOffset>
@@ -3023,7 +2939,7 @@
                 </mc:Choice>
                 <mc:Fallback>
                   <w:pict>
-                    <v:rect w14:anchorId="1043F54F" id="_x0000_s1035" style="position:absolute;left:0;text-align:left;margin-left:369.4pt;margin-top:128.5pt;width:48.15pt;height:27.35pt;z-index:251702272;visibility:visible;mso-wrap-style:square;mso-width-percent:0;mso-height-percent:0;mso-wrap-distance-left:9pt;mso-wrap-distance-top:0;mso-wrap-distance-right:9pt;mso-wrap-distance-bottom:0;mso-position-horizontal:absolute;mso-position-horizontal-relative:text;mso-position-vertical:absolute;mso-position-vertical-relative:text;mso-width-percent:0;mso-height-percent:0;mso-width-relative:margin;mso-height-relative:margin;v-text-anchor:middle" o:gfxdata="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" fillcolor="black" strokecolor="red" strokeweight="1pt">
+                    <v:rect w14:anchorId="1043F54F" id="_x0000_s1035" style="position:absolute;left:0;text-align:left;margin-left:369.4pt;margin-top:128.5pt;width:48.15pt;height:27.35pt;z-index:251780096;visibility:visible;mso-wrap-style:square;mso-width-percent:0;mso-height-percent:0;mso-wrap-distance-left:9pt;mso-wrap-distance-top:0;mso-wrap-distance-right:9pt;mso-wrap-distance-bottom:0;mso-position-horizontal:absolute;mso-position-horizontal-relative:text;mso-position-vertical:absolute;mso-position-vertical-relative:text;mso-width-percent:0;mso-height-percent:0;mso-width-relative:margin;mso-height-relative:margin;v-text-anchor:middle" o:gfxdata="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" fillcolor="black" strokecolor="red" strokeweight="1pt">
                       <v:fill opacity="39321f"/>
                       <v:textbox inset="0,0,0,0">
                         <w:txbxContent>
@@ -3069,6 +2985,7 @@
             </w:r>
             <w:r>
               <w:rPr>
+                <w:noProof/>
                 <w:color w:val="FFFFFF" w:themeColor="background1"/>
                 <w:sz w:val="32"/>
                 <w:szCs w:val="32"/>
@@ -3076,7 +2993,7 @@
               <mc:AlternateContent>
                 <mc:Choice Requires="wps">
                   <w:drawing>
-                    <wp:anchor distT="0" distB="0" distL="114300" distR="114300" simplePos="0" relativeHeight="251711488" behindDoc="0" locked="0" layoutInCell="1" allowOverlap="1" wp14:anchorId="25588F0F" wp14:editId="001EE4CD">
+                    <wp:anchor distT="0" distB="0" distL="114300" distR="114300" simplePos="0" relativeHeight="251784192" behindDoc="0" locked="0" layoutInCell="1" allowOverlap="1" wp14:anchorId="25588F0F" wp14:editId="001EE4CD">
                       <wp:simplePos x="0" y="0"/>
                       <wp:positionH relativeFrom="column">
                         <wp:posOffset>4898707</wp:posOffset>
@@ -3146,7 +3063,7 @@
                 </mc:Choice>
                 <mc:Fallback>
                   <w:pict>
-                    <v:oval w14:anchorId="0CB53AF1" id="Oval 1" o:spid="_x0000_s1026" style="position:absolute;margin-left:385.7pt;margin-top:230.45pt;width:7.5pt;height:7.5pt;z-index:251711488;visibility:visible;mso-wrap-style:square;mso-width-percent:0;mso-height-percent:0;mso-wrap-distance-left:9pt;mso-wrap-distance-top:0;mso-wrap-distance-right:9pt;mso-wrap-distance-bottom:0;mso-position-horizontal:absolute;mso-position-horizontal-relative:text;mso-position-vertical:absolute;mso-position-vertical-relative:text;mso-width-percent:0;mso-height-percent:0;mso-width-relative:margin;mso-height-relative:margin;v-text-anchor:middle" o:gfxdata="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" fillcolor="#00b050" strokecolor="white [3212]">
+                    <v:oval w14:anchorId="40598DB0" id="Oval 1" o:spid="_x0000_s1026" style="position:absolute;margin-left:385.7pt;margin-top:230.45pt;width:7.5pt;height:7.5pt;z-index:251784192;visibility:visible;mso-wrap-style:square;mso-width-percent:0;mso-height-percent:0;mso-wrap-distance-left:9pt;mso-wrap-distance-top:0;mso-wrap-distance-right:9pt;mso-wrap-distance-bottom:0;mso-position-horizontal:absolute;mso-position-horizontal-relative:text;mso-position-vertical:absolute;mso-position-vertical-relative:text;mso-width-percent:0;mso-height-percent:0;mso-width-relative:margin;mso-height-relative:margin;v-text-anchor:middle" o:gfxdata="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" fillcolor="#00b050" strokecolor="white [3212]">
                       <v:stroke joinstyle="miter"/>
                     </v:oval>
                   </w:pict>
@@ -3155,6 +3072,7 @@
             </w:r>
             <w:r>
               <w:rPr>
+                <w:noProof/>
                 <w:color w:val="FFFFFF" w:themeColor="background1"/>
                 <w:sz w:val="32"/>
                 <w:szCs w:val="32"/>
@@ -3162,7 +3080,7 @@
               <mc:AlternateContent>
                 <mc:Choice Requires="wps">
                   <w:drawing>
-                    <wp:anchor distT="0" distB="0" distL="114300" distR="114300" simplePos="0" relativeHeight="251709440" behindDoc="0" locked="0" layoutInCell="1" allowOverlap="1" wp14:anchorId="36330DBF" wp14:editId="3C3C4B57">
+                    <wp:anchor distT="0" distB="0" distL="114300" distR="114300" simplePos="0" relativeHeight="251783168" behindDoc="0" locked="0" layoutInCell="1" allowOverlap="1" wp14:anchorId="36330DBF" wp14:editId="3C3C4B57">
                       <wp:simplePos x="0" y="0"/>
                       <wp:positionH relativeFrom="column">
                         <wp:posOffset>3751897</wp:posOffset>
@@ -3232,7 +3150,7 @@
                 </mc:Choice>
                 <mc:Fallback>
                   <w:pict>
-                    <v:oval w14:anchorId="2EBB200F" id="Oval 1" o:spid="_x0000_s1026" style="position:absolute;margin-left:295.4pt;margin-top:240.5pt;width:7.5pt;height:7.5pt;z-index:251709440;visibility:visible;mso-wrap-style:square;mso-width-percent:0;mso-height-percent:0;mso-wrap-distance-left:9pt;mso-wrap-distance-top:0;mso-wrap-distance-right:9pt;mso-wrap-distance-bottom:0;mso-position-horizontal:absolute;mso-position-horizontal-relative:text;mso-position-vertical:absolute;mso-position-vertical-relative:text;mso-width-percent:0;mso-height-percent:0;mso-width-relative:margin;mso-height-relative:margin;v-text-anchor:middle" o:gfxdata="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" fillcolor="#00b050" strokecolor="white [3212]">
+                    <v:oval w14:anchorId="4060882C" id="Oval 1" o:spid="_x0000_s1026" style="position:absolute;margin-left:295.4pt;margin-top:240.5pt;width:7.5pt;height:7.5pt;z-index:251783168;visibility:visible;mso-wrap-style:square;mso-width-percent:0;mso-height-percent:0;mso-wrap-distance-left:9pt;mso-wrap-distance-top:0;mso-wrap-distance-right:9pt;mso-wrap-distance-bottom:0;mso-position-horizontal:absolute;mso-position-horizontal-relative:text;mso-position-vertical:absolute;mso-position-vertical-relative:text;mso-width-percent:0;mso-height-percent:0;mso-width-relative:margin;mso-height-relative:margin;v-text-anchor:middle" o:gfxdata="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" fillcolor="#00b050" strokecolor="white [3212]">
                       <v:stroke joinstyle="miter"/>
                     </v:oval>
                   </w:pict>
@@ -3241,6 +3159,7 @@
             </w:r>
             <w:r>
               <w:rPr>
+                <w:noProof/>
                 <w:color w:val="FFFFFF" w:themeColor="background1"/>
                 <w:sz w:val="32"/>
                 <w:szCs w:val="32"/>
@@ -3248,7 +3167,7 @@
               <mc:AlternateContent>
                 <mc:Choice Requires="wps">
                   <w:drawing>
-                    <wp:anchor distT="0" distB="0" distL="114300" distR="114300" simplePos="0" relativeHeight="251706368" behindDoc="0" locked="0" layoutInCell="1" allowOverlap="1" wp14:anchorId="0EAA3F5E" wp14:editId="70230B4A">
+                    <wp:anchor distT="0" distB="0" distL="114300" distR="114300" simplePos="0" relativeHeight="251781120" behindDoc="0" locked="0" layoutInCell="1" allowOverlap="1" wp14:anchorId="0EAA3F5E" wp14:editId="70230B4A">
                       <wp:simplePos x="0" y="0"/>
                       <wp:positionH relativeFrom="column">
                         <wp:posOffset>1271270</wp:posOffset>
@@ -3318,7 +3237,7 @@
                 </mc:Choice>
                 <mc:Fallback>
                   <w:pict>
-                    <v:oval w14:anchorId="1CA2B587" id="Oval 1" o:spid="_x0000_s1026" style="position:absolute;margin-left:100.1pt;margin-top:159.95pt;width:7.5pt;height:7.5pt;z-index:251706368;visibility:visible;mso-wrap-style:square;mso-width-percent:0;mso-height-percent:0;mso-wrap-distance-left:9pt;mso-wrap-distance-top:0;mso-wrap-distance-right:9pt;mso-wrap-distance-bottom:0;mso-position-horizontal:absolute;mso-position-horizontal-relative:text;mso-position-vertical:absolute;mso-position-vertical-relative:text;mso-width-percent:0;mso-height-percent:0;mso-width-relative:margin;mso-height-relative:margin;v-text-anchor:middle" o:gfxdata="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" fillcolor="#00b050" strokecolor="white [3212]">
+                    <v:oval w14:anchorId="37C7FF0C" id="Oval 1" o:spid="_x0000_s1026" style="position:absolute;margin-left:100.1pt;margin-top:159.95pt;width:7.5pt;height:7.5pt;z-index:251781120;visibility:visible;mso-wrap-style:square;mso-width-percent:0;mso-height-percent:0;mso-wrap-distance-left:9pt;mso-wrap-distance-top:0;mso-wrap-distance-right:9pt;mso-wrap-distance-bottom:0;mso-position-horizontal:absolute;mso-position-horizontal-relative:text;mso-position-vertical:absolute;mso-position-vertical-relative:text;mso-width-percent:0;mso-height-percent:0;mso-width-relative:margin;mso-height-relative:margin;v-text-anchor:middle" o:gfxdata="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" fillcolor="#00b050" strokecolor="white [3212]">
                       <v:stroke joinstyle="miter"/>
                     </v:oval>
                   </w:pict>
@@ -3327,6 +3246,7 @@
             </w:r>
             <w:r>
               <w:rPr>
+                <w:noProof/>
                 <w:color w:val="FFFFFF" w:themeColor="background1"/>
                 <w:sz w:val="32"/>
                 <w:szCs w:val="32"/>
@@ -3334,7 +3254,7 @@
               <mc:AlternateContent>
                 <mc:Choice Requires="wps">
                   <w:drawing>
-                    <wp:anchor distT="0" distB="0" distL="114300" distR="114300" simplePos="0" relativeHeight="251707392" behindDoc="0" locked="0" layoutInCell="1" allowOverlap="1" wp14:anchorId="2362C21C" wp14:editId="0B751770">
+                    <wp:anchor distT="0" distB="0" distL="114300" distR="114300" simplePos="0" relativeHeight="251782144" behindDoc="0" locked="0" layoutInCell="1" allowOverlap="1" wp14:anchorId="2362C21C" wp14:editId="0B751770">
                       <wp:simplePos x="0" y="0"/>
                       <wp:positionH relativeFrom="column">
                         <wp:posOffset>2758758</wp:posOffset>
@@ -3404,7 +3324,7 @@
                 </mc:Choice>
                 <mc:Fallback>
                   <w:pict>
-                    <v:oval w14:anchorId="0C9F791C" id="Oval 1" o:spid="_x0000_s1026" style="position:absolute;margin-left:217.25pt;margin-top:240.6pt;width:7.5pt;height:7.5pt;z-index:251707392;visibility:visible;mso-wrap-style:square;mso-width-percent:0;mso-height-percent:0;mso-wrap-distance-left:9pt;mso-wrap-distance-top:0;mso-wrap-distance-right:9pt;mso-wrap-distance-bottom:0;mso-position-horizontal:absolute;mso-position-horizontal-relative:text;mso-position-vertical:absolute;mso-position-vertical-relative:text;mso-width-percent:0;mso-height-percent:0;mso-width-relative:margin;mso-height-relative:margin;v-text-anchor:middle" o:gfxdata="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" fillcolor="#00b050" strokecolor="white [3212]">
+                    <v:oval w14:anchorId="510C8F91" id="Oval 1" o:spid="_x0000_s1026" style="position:absolute;margin-left:217.25pt;margin-top:240.6pt;width:7.5pt;height:7.5pt;z-index:251782144;visibility:visible;mso-wrap-style:square;mso-width-percent:0;mso-height-percent:0;mso-wrap-distance-left:9pt;mso-wrap-distance-top:0;mso-wrap-distance-right:9pt;mso-wrap-distance-bottom:0;mso-position-horizontal:absolute;mso-position-horizontal-relative:text;mso-position-vertical:absolute;mso-position-vertical-relative:text;mso-width-percent:0;mso-height-percent:0;mso-width-relative:margin;mso-height-relative:margin;v-text-anchor:middle" o:gfxdata="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" fillcolor="#00b050" strokecolor="white [3212]">
                       <v:stroke joinstyle="miter"/>
                     </v:oval>
                   </w:pict>
@@ -3413,6 +3333,7 @@
             </w:r>
             <w:r>
               <w:rPr>
+                <w:noProof/>
                 <w:color w:val="FFFFFF" w:themeColor="background1"/>
                 <w:sz w:val="32"/>
                 <w:szCs w:val="32"/>
@@ -3420,7 +3341,7 @@
               <mc:AlternateContent>
                 <mc:Choice Requires="wps">
                   <w:drawing>
-                    <wp:anchor distT="0" distB="0" distL="114300" distR="114300" simplePos="0" relativeHeight="251688960" behindDoc="0" locked="0" layoutInCell="1" allowOverlap="1" wp14:anchorId="2CBDD507" wp14:editId="2610D96A">
+                    <wp:anchor distT="0" distB="0" distL="114300" distR="114300" simplePos="0" relativeHeight="251773952" behindDoc="0" locked="0" layoutInCell="1" allowOverlap="1" wp14:anchorId="2CBDD507" wp14:editId="2610D96A">
                       <wp:simplePos x="0" y="0"/>
                       <wp:positionH relativeFrom="column">
                         <wp:posOffset>3889058</wp:posOffset>
@@ -3529,7 +3450,7 @@
                 </mc:Choice>
                 <mc:Fallback>
                   <w:pict>
-                    <v:rect w14:anchorId="2CBDD507" id="_x0000_s1036" style="position:absolute;left:0;text-align:left;margin-left:306.25pt;margin-top:274pt;width:78.7pt;height:30.15pt;z-index:251688960;visibility:visible;mso-wrap-style:square;mso-width-percent:0;mso-height-percent:0;mso-wrap-distance-left:9pt;mso-wrap-distance-top:0;mso-wrap-distance-right:9pt;mso-wrap-distance-bottom:0;mso-position-horizontal:absolute;mso-position-horizontal-relative:text;mso-position-vertical:absolute;mso-position-vertical-relative:text;mso-width-percent:0;mso-height-percent:0;mso-width-relative:margin;mso-height-relative:margin;v-text-anchor:middle" o:gfxdata="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" fillcolor="black" strokecolor="red" strokeweight="1pt">
+                    <v:rect w14:anchorId="2CBDD507" id="_x0000_s1036" style="position:absolute;left:0;text-align:left;margin-left:306.25pt;margin-top:274pt;width:78.7pt;height:30.15pt;z-index:251773952;visibility:visible;mso-wrap-style:square;mso-width-percent:0;mso-height-percent:0;mso-wrap-distance-left:9pt;mso-wrap-distance-top:0;mso-wrap-distance-right:9pt;mso-wrap-distance-bottom:0;mso-position-horizontal:absolute;mso-position-horizontal-relative:text;mso-position-vertical:absolute;mso-position-vertical-relative:text;mso-width-percent:0;mso-height-percent:0;mso-width-relative:margin;mso-height-relative:margin;v-text-anchor:middle" o:gfxdata="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" fillcolor="black" strokecolor="red" strokeweight="1pt">
                       <v:fill opacity="39321f"/>
                       <v:textbox inset="0,0,0,0">
                         <w:txbxContent>
@@ -3575,6 +3496,7 @@
             </w:r>
             <w:r>
               <w:rPr>
+                <w:noProof/>
                 <w:color w:val="FFFFFF" w:themeColor="background1"/>
                 <w:sz w:val="32"/>
                 <w:szCs w:val="32"/>
@@ -3582,7 +3504,7 @@
               <mc:AlternateContent>
                 <mc:Choice Requires="wps">
                   <w:drawing>
-                    <wp:anchor distT="0" distB="0" distL="114300" distR="114300" simplePos="0" relativeHeight="251694080" behindDoc="0" locked="0" layoutInCell="1" allowOverlap="1" wp14:anchorId="01FDE6F4" wp14:editId="6F71740C">
+                    <wp:anchor distT="0" distB="0" distL="114300" distR="114300" simplePos="0" relativeHeight="251777024" behindDoc="0" locked="0" layoutInCell="1" allowOverlap="1" wp14:anchorId="01FDE6F4" wp14:editId="6F71740C">
                       <wp:simplePos x="0" y="0"/>
                       <wp:positionH relativeFrom="column">
                         <wp:posOffset>1313612</wp:posOffset>
@@ -3691,7 +3613,7 @@
                 </mc:Choice>
                 <mc:Fallback>
                   <w:pict>
-                    <v:rect w14:anchorId="01FDE6F4" id="_x0000_s1037" style="position:absolute;left:0;text-align:left;margin-left:103.45pt;margin-top:319.2pt;width:52pt;height:25.5pt;z-index:251694080;visibility:visible;mso-wrap-style:square;mso-width-percent:0;mso-height-percent:0;mso-wrap-distance-left:9pt;mso-wrap-distance-top:0;mso-wrap-distance-right:9pt;mso-wrap-distance-bottom:0;mso-position-horizontal:absolute;mso-position-horizontal-relative:text;mso-position-vertical:absolute;mso-position-vertical-relative:text;mso-width-percent:0;mso-height-percent:0;mso-width-relative:margin;mso-height-relative:margin;v-text-anchor:middle" o:gfxdata="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" fillcolor="black" strokecolor="red" strokeweight="1pt">
+                    <v:rect w14:anchorId="01FDE6F4" id="_x0000_s1037" style="position:absolute;left:0;text-align:left;margin-left:103.45pt;margin-top:319.2pt;width:52pt;height:25.5pt;z-index:251777024;visibility:visible;mso-wrap-style:square;mso-width-percent:0;mso-height-percent:0;mso-wrap-distance-left:9pt;mso-wrap-distance-top:0;mso-wrap-distance-right:9pt;mso-wrap-distance-bottom:0;mso-position-horizontal:absolute;mso-position-horizontal-relative:text;mso-position-vertical:absolute;mso-position-vertical-relative:text;mso-width-percent:0;mso-height-percent:0;mso-width-relative:margin;mso-height-relative:margin;v-text-anchor:middle" o:gfxdata="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" fillcolor="black" strokecolor="red" strokeweight="1pt">
                       <v:fill opacity="39321f"/>
                       <v:textbox inset="0,0,0,0">
                         <w:txbxContent>
@@ -3737,6 +3659,7 @@
             </w:r>
             <w:r>
               <w:rPr>
+                <w:noProof/>
                 <w:color w:val="FFFFFF" w:themeColor="background1"/>
                 <w:sz w:val="32"/>
                 <w:szCs w:val="32"/>
@@ -3744,7 +3667,7 @@
               <mc:AlternateContent>
                 <mc:Choice Requires="wps">
                   <w:drawing>
-                    <wp:anchor distT="0" distB="0" distL="114300" distR="114300" simplePos="0" relativeHeight="251676672" behindDoc="0" locked="0" layoutInCell="1" allowOverlap="1" wp14:anchorId="62E3AE57" wp14:editId="6E7DE791">
+                    <wp:anchor distT="0" distB="0" distL="114300" distR="114300" simplePos="0" relativeHeight="251768832" behindDoc="0" locked="0" layoutInCell="1" allowOverlap="1" wp14:anchorId="62E3AE57" wp14:editId="6E7DE791">
                       <wp:simplePos x="0" y="0"/>
                       <wp:positionH relativeFrom="column">
                         <wp:posOffset>2127885</wp:posOffset>
@@ -3805,7 +3728,7 @@
                 </mc:Choice>
                 <mc:Fallback>
                   <w:pict>
-                    <v:shape w14:anchorId="784B59A1" id="Straight Arrow Connector 2" o:spid="_x0000_s1026" type="#_x0000_t32" style="position:absolute;margin-left:167.55pt;margin-top:144.25pt;width:15.95pt;height:49.65pt;flip:y;z-index:251676672;visibility:visible;mso-wrap-style:square;mso-width-percent:0;mso-height-percent:0;mso-wrap-distance-left:9pt;mso-wrap-distance-top:0;mso-wrap-distance-right:9pt;mso-wrap-distance-bottom:0;mso-position-horizontal:absolute;mso-position-horizontal-relative:text;mso-position-vertical:absolute;mso-position-vertical-relative:text;mso-width-percent:0;mso-height-percent:0;mso-width-relative:margin;mso-height-relative:margin" o:gfxdata="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" strokecolor="red" strokeweight="1.5pt">
+                    <v:shape w14:anchorId="7B2E0FD2" id="Straight Arrow Connector 2" o:spid="_x0000_s1026" type="#_x0000_t32" style="position:absolute;margin-left:167.55pt;margin-top:144.25pt;width:15.95pt;height:49.65pt;flip:y;z-index:251768832;visibility:visible;mso-wrap-style:square;mso-width-percent:0;mso-height-percent:0;mso-wrap-distance-left:9pt;mso-wrap-distance-top:0;mso-wrap-distance-right:9pt;mso-wrap-distance-bottom:0;mso-position-horizontal:absolute;mso-position-horizontal-relative:text;mso-position-vertical:absolute;mso-position-vertical-relative:text;mso-width-percent:0;mso-height-percent:0;mso-width-relative:margin;mso-height-relative:margin" o:gfxdata="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" strokecolor="red" strokeweight="1.5pt">
                       <v:stroke endarrow="block" joinstyle="miter"/>
                     </v:shape>
                   </w:pict>
@@ -3814,6 +3737,7 @@
             </w:r>
             <w:r>
               <w:rPr>
+                <w:noProof/>
                 <w:color w:val="FFFFFF" w:themeColor="background1"/>
                 <w:sz w:val="32"/>
                 <w:szCs w:val="32"/>
@@ -3821,7 +3745,7 @@
               <mc:AlternateContent>
                 <mc:Choice Requires="wps">
                   <w:drawing>
-                    <wp:anchor distT="0" distB="0" distL="114300" distR="114300" simplePos="0" relativeHeight="251675648" behindDoc="0" locked="0" layoutInCell="1" allowOverlap="1" wp14:anchorId="30B8046B" wp14:editId="6F29A593">
+                    <wp:anchor distT="0" distB="0" distL="114300" distR="114300" simplePos="0" relativeHeight="251767808" behindDoc="0" locked="0" layoutInCell="1" allowOverlap="1" wp14:anchorId="30B8046B" wp14:editId="6F29A593">
                       <wp:simplePos x="0" y="0"/>
                       <wp:positionH relativeFrom="column">
                         <wp:posOffset>1824990</wp:posOffset>
@@ -3930,7 +3854,7 @@
                 </mc:Choice>
                 <mc:Fallback>
                   <w:pict>
-                    <v:rect w14:anchorId="30B8046B" id="_x0000_s1038" style="position:absolute;left:0;text-align:left;margin-left:143.7pt;margin-top:194.05pt;width:48.15pt;height:17pt;z-index:251675648;visibility:visible;mso-wrap-style:square;mso-width-percent:0;mso-height-percent:0;mso-wrap-distance-left:9pt;mso-wrap-distance-top:0;mso-wrap-distance-right:9pt;mso-wrap-distance-bottom:0;mso-position-horizontal:absolute;mso-position-horizontal-relative:text;mso-position-vertical:absolute;mso-position-vertical-relative:text;mso-width-percent:0;mso-height-percent:0;mso-width-relative:margin;mso-height-relative:margin;v-text-anchor:middle" o:gfxdata="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" fillcolor="black" strokecolor="red" strokeweight="1pt">
+                    <v:rect w14:anchorId="30B8046B" id="_x0000_s1038" style="position:absolute;left:0;text-align:left;margin-left:143.7pt;margin-top:194.05pt;width:48.15pt;height:17pt;z-index:251767808;visibility:visible;mso-wrap-style:square;mso-width-percent:0;mso-height-percent:0;mso-wrap-distance-left:9pt;mso-wrap-distance-top:0;mso-wrap-distance-right:9pt;mso-wrap-distance-bottom:0;mso-position-horizontal:absolute;mso-position-horizontal-relative:text;mso-position-vertical:absolute;mso-position-vertical-relative:text;mso-width-percent:0;mso-height-percent:0;mso-width-relative:margin;mso-height-relative:margin;v-text-anchor:middle" o:gfxdata="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" fillcolor="black" strokecolor="red" strokeweight="1pt">
                       <v:fill opacity="39321f"/>
                       <v:textbox inset="0,0,0,0">
                         <w:txbxContent>
@@ -3976,6 +3900,7 @@
             </w:r>
             <w:r>
               <w:rPr>
+                <w:noProof/>
                 <w:color w:val="FFFFFF" w:themeColor="background1"/>
                 <w:sz w:val="32"/>
                 <w:szCs w:val="32"/>
@@ -3983,7 +3908,7 @@
               <mc:AlternateContent>
                 <mc:Choice Requires="wps">
                   <w:drawing>
-                    <wp:anchor distT="0" distB="0" distL="114300" distR="114300" simplePos="0" relativeHeight="251692032" behindDoc="0" locked="0" layoutInCell="1" allowOverlap="1" wp14:anchorId="5011B118" wp14:editId="2BC1FB01">
+                    <wp:anchor distT="0" distB="0" distL="114300" distR="114300" simplePos="0" relativeHeight="251776000" behindDoc="0" locked="0" layoutInCell="1" allowOverlap="1" wp14:anchorId="5011B118" wp14:editId="2BC1FB01">
                       <wp:simplePos x="0" y="0"/>
                       <wp:positionH relativeFrom="column">
                         <wp:posOffset>4922520</wp:posOffset>
@@ -4083,7 +4008,39 @@
                                       </w14:shadow>
                                     </w:rPr>
                                     <w:br/>
-                                    <w:t>←L  R→</w:t>
+                                    <w:t>←</w:t>
+                                  </w:r>
+                                  <w:proofErr w:type="gramStart"/>
+                                  <w:r>
+                                    <w:rPr>
+                                      <w:b/>
+                                      <w:bCs/>
+                                      <w:color w:val="FF0000"/>
+                                      <w:sz w:val="20"/>
+                                      <w:szCs w:val="20"/>
+                                      <w14:shadow w14:blurRad="50800" w14:dist="38100" w14:dir="2700000" w14:sx="100000" w14:sy="100000" w14:kx="0" w14:ky="0" w14:algn="tl">
+                                        <w14:srgbClr w14:val="000000">
+                                          <w14:alpha w14:val="60000"/>
+                                        </w14:srgbClr>
+                                      </w14:shadow>
+                                    </w:rPr>
+                                    <w:t>L  R</w:t>
+                                  </w:r>
+                                  <w:proofErr w:type="gramEnd"/>
+                                  <w:r>
+                                    <w:rPr>
+                                      <w:b/>
+                                      <w:bCs/>
+                                      <w:color w:val="FF0000"/>
+                                      <w:sz w:val="20"/>
+                                      <w:szCs w:val="20"/>
+                                      <w14:shadow w14:blurRad="50800" w14:dist="38100" w14:dir="2700000" w14:sx="100000" w14:sy="100000" w14:kx="0" w14:ky="0" w14:algn="tl">
+                                        <w14:srgbClr w14:val="000000">
+                                          <w14:alpha w14:val="60000"/>
+                                        </w14:srgbClr>
+                                      </w14:shadow>
+                                    </w:rPr>
+                                    <w:t>→</w:t>
                                   </w:r>
                                 </w:p>
                               </w:txbxContent>
@@ -4108,7 +4065,7 @@
                 </mc:Choice>
                 <mc:Fallback>
                   <w:pict>
-                    <v:rect w14:anchorId="5011B118" id="_x0000_s1039" style="position:absolute;left:0;text-align:left;margin-left:387.6pt;margin-top:329pt;width:39.15pt;height:25.5pt;z-index:251692032;visibility:visible;mso-wrap-style:square;mso-width-percent:0;mso-height-percent:0;mso-wrap-distance-left:9pt;mso-wrap-distance-top:0;mso-wrap-distance-right:9pt;mso-wrap-distance-bottom:0;mso-position-horizontal:absolute;mso-position-horizontal-relative:text;mso-position-vertical:absolute;mso-position-vertical-relative:text;mso-width-percent:0;mso-height-percent:0;mso-width-relative:margin;mso-height-relative:margin;v-text-anchor:middle" o:gfxdata="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" fillcolor="black" strokecolor="red" strokeweight="1pt">
+                    <v:rect w14:anchorId="5011B118" id="_x0000_s1039" style="position:absolute;left:0;text-align:left;margin-left:387.6pt;margin-top:329pt;width:39.15pt;height:25.5pt;z-index:251776000;visibility:visible;mso-wrap-style:square;mso-width-percent:0;mso-height-percent:0;mso-wrap-distance-left:9pt;mso-wrap-distance-top:0;mso-wrap-distance-right:9pt;mso-wrap-distance-bottom:0;mso-position-horizontal:absolute;mso-position-horizontal-relative:text;mso-position-vertical:absolute;mso-position-vertical-relative:text;mso-width-percent:0;mso-height-percent:0;mso-width-relative:margin;mso-height-relative:margin;v-text-anchor:middle" o:gfxdata="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" fillcolor="black" strokecolor="red" strokeweight="1pt">
                       <v:fill opacity="39321f"/>
                       <v:textbox inset="0,0,0,0">
                         <w:txbxContent>
@@ -4158,7 +4115,39 @@
                                 </w14:shadow>
                               </w:rPr>
                               <w:br/>
-                              <w:t>←L  R→</w:t>
+                              <w:t>←</w:t>
+                            </w:r>
+                            <w:proofErr w:type="gramStart"/>
+                            <w:r>
+                              <w:rPr>
+                                <w:b/>
+                                <w:bCs/>
+                                <w:color w:val="FF0000"/>
+                                <w:sz w:val="20"/>
+                                <w:szCs w:val="20"/>
+                                <w14:shadow w14:blurRad="50800" w14:dist="38100" w14:dir="2700000" w14:sx="100000" w14:sy="100000" w14:kx="0" w14:ky="0" w14:algn="tl">
+                                  <w14:srgbClr w14:val="000000">
+                                    <w14:alpha w14:val="60000"/>
+                                  </w14:srgbClr>
+                                </w14:shadow>
+                              </w:rPr>
+                              <w:t>L  R</w:t>
+                            </w:r>
+                            <w:proofErr w:type="gramEnd"/>
+                            <w:r>
+                              <w:rPr>
+                                <w:b/>
+                                <w:bCs/>
+                                <w:color w:val="FF0000"/>
+                                <w:sz w:val="20"/>
+                                <w:szCs w:val="20"/>
+                                <w14:shadow w14:blurRad="50800" w14:dist="38100" w14:dir="2700000" w14:sx="100000" w14:sy="100000" w14:kx="0" w14:ky="0" w14:algn="tl">
+                                  <w14:srgbClr w14:val="000000">
+                                    <w14:alpha w14:val="60000"/>
+                                  </w14:srgbClr>
+                                </w14:shadow>
+                              </w:rPr>
+                              <w:t>→</w:t>
                             </w:r>
                           </w:p>
                         </w:txbxContent>
@@ -4170,6 +4159,7 @@
             </w:r>
             <w:r>
               <w:rPr>
+                <w:noProof/>
                 <w:color w:val="FFFFFF" w:themeColor="background1"/>
                 <w:sz w:val="32"/>
                 <w:szCs w:val="32"/>
@@ -4177,7 +4167,7 @@
               <mc:AlternateContent>
                 <mc:Choice Requires="wps">
                   <w:drawing>
-                    <wp:anchor distT="0" distB="0" distL="114300" distR="114300" simplePos="0" relativeHeight="251689984" behindDoc="0" locked="0" layoutInCell="1" allowOverlap="1" wp14:anchorId="2F3507D2" wp14:editId="4BC71FEB">
+                    <wp:anchor distT="0" distB="0" distL="114300" distR="114300" simplePos="0" relativeHeight="251774976" behindDoc="0" locked="0" layoutInCell="1" allowOverlap="1" wp14:anchorId="2F3507D2" wp14:editId="4BC71FEB">
                       <wp:simplePos x="0" y="0"/>
                       <wp:positionH relativeFrom="column">
                         <wp:posOffset>4376420</wp:posOffset>
@@ -4238,7 +4228,7 @@
                 </mc:Choice>
                 <mc:Fallback>
                   <w:pict>
-                    <v:shape w14:anchorId="4C54C906" id="Straight Arrow Connector 2" o:spid="_x0000_s1026" type="#_x0000_t32" style="position:absolute;margin-left:344.6pt;margin-top:304.25pt;width:25pt;height:22.75pt;z-index:251689984;visibility:visible;mso-wrap-style:square;mso-width-percent:0;mso-height-percent:0;mso-wrap-distance-left:9pt;mso-wrap-distance-top:0;mso-wrap-distance-right:9pt;mso-wrap-distance-bottom:0;mso-position-horizontal:absolute;mso-position-horizontal-relative:text;mso-position-vertical:absolute;mso-position-vertical-relative:text;mso-width-percent:0;mso-height-percent:0;mso-width-relative:margin;mso-height-relative:margin" o:gfxdata="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" strokecolor="red" strokeweight="1.5pt">
+                    <v:shape w14:anchorId="754CA797" id="Straight Arrow Connector 2" o:spid="_x0000_s1026" type="#_x0000_t32" style="position:absolute;margin-left:344.6pt;margin-top:304.25pt;width:25pt;height:22.75pt;z-index:251774976;visibility:visible;mso-wrap-style:square;mso-width-percent:0;mso-height-percent:0;mso-wrap-distance-left:9pt;mso-wrap-distance-top:0;mso-wrap-distance-right:9pt;mso-wrap-distance-bottom:0;mso-position-horizontal:absolute;mso-position-horizontal-relative:text;mso-position-vertical:absolute;mso-position-vertical-relative:text;mso-width-percent:0;mso-height-percent:0;mso-width-relative:margin;mso-height-relative:margin" o:gfxdata="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" strokecolor="red" strokeweight="1.5pt">
                       <v:stroke endarrow="block" joinstyle="miter"/>
                     </v:shape>
                   </w:pict>
@@ -4247,6 +4237,7 @@
             </w:r>
             <w:r>
               <w:rPr>
+                <w:noProof/>
                 <w:color w:val="FFFFFF" w:themeColor="background1"/>
                 <w:sz w:val="32"/>
                 <w:szCs w:val="32"/>
@@ -4254,7 +4245,7 @@
               <mc:AlternateContent>
                 <mc:Choice Requires="wps">
                   <w:drawing>
-                    <wp:anchor distT="0" distB="0" distL="114300" distR="114300" simplePos="0" relativeHeight="251682816" behindDoc="0" locked="0" layoutInCell="1" allowOverlap="1" wp14:anchorId="189BDC66" wp14:editId="312049F2">
+                    <wp:anchor distT="0" distB="0" distL="114300" distR="114300" simplePos="0" relativeHeight="251770880" behindDoc="0" locked="0" layoutInCell="1" allowOverlap="1" wp14:anchorId="189BDC66" wp14:editId="312049F2">
                       <wp:simplePos x="0" y="0"/>
                       <wp:positionH relativeFrom="column">
                         <wp:posOffset>3617595</wp:posOffset>
@@ -4363,7 +4354,7 @@
                 </mc:Choice>
                 <mc:Fallback>
                   <w:pict>
-                    <v:rect w14:anchorId="189BDC66" id="_x0000_s1040" style="position:absolute;left:0;text-align:left;margin-left:284.85pt;margin-top:385.75pt;width:48.15pt;height:25.5pt;z-index:251682816;visibility:visible;mso-wrap-style:square;mso-width-percent:0;mso-height-percent:0;mso-wrap-distance-left:9pt;mso-wrap-distance-top:0;mso-wrap-distance-right:9pt;mso-wrap-distance-bottom:0;mso-position-horizontal:absolute;mso-position-horizontal-relative:text;mso-position-vertical:absolute;mso-position-vertical-relative:text;mso-width-percent:0;mso-height-percent:0;mso-width-relative:margin;mso-height-relative:margin;v-text-anchor:middle" o:gfxdata="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" fillcolor="black" strokecolor="red" strokeweight="1pt">
+                    <v:rect w14:anchorId="189BDC66" id="_x0000_s1040" style="position:absolute;left:0;text-align:left;margin-left:284.85pt;margin-top:385.75pt;width:48.15pt;height:25.5pt;z-index:251770880;visibility:visible;mso-wrap-style:square;mso-width-percent:0;mso-height-percent:0;mso-wrap-distance-left:9pt;mso-wrap-distance-top:0;mso-wrap-distance-right:9pt;mso-wrap-distance-bottom:0;mso-position-horizontal:absolute;mso-position-horizontal-relative:text;mso-position-vertical:absolute;mso-position-vertical-relative:text;mso-width-percent:0;mso-height-percent:0;mso-width-relative:margin;mso-height-relative:margin;v-text-anchor:middle" o:gfxdata="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" fillcolor="black" strokecolor="red" strokeweight="1pt">
                       <v:fill opacity="39321f"/>
                       <v:textbox inset="0,0,0,0">
                         <w:txbxContent>
@@ -4409,6 +4400,7 @@
             </w:r>
             <w:r>
               <w:rPr>
+                <w:noProof/>
                 <w:color w:val="FFFFFF" w:themeColor="background1"/>
                 <w:sz w:val="32"/>
                 <w:szCs w:val="32"/>
@@ -4416,7 +4408,7 @@
               <mc:AlternateContent>
                 <mc:Choice Requires="wps">
                   <w:drawing>
-                    <wp:anchor distT="0" distB="0" distL="114300" distR="114300" simplePos="0" relativeHeight="251684864" behindDoc="0" locked="0" layoutInCell="1" allowOverlap="1" wp14:anchorId="52C438C6" wp14:editId="4B3B01EC">
+                    <wp:anchor distT="0" distB="0" distL="114300" distR="114300" simplePos="0" relativeHeight="251771904" behindDoc="0" locked="0" layoutInCell="1" allowOverlap="1" wp14:anchorId="52C438C6" wp14:editId="4B3B01EC">
                       <wp:simplePos x="0" y="0"/>
                       <wp:positionH relativeFrom="column">
                         <wp:posOffset>2325370</wp:posOffset>
@@ -4541,7 +4533,7 @@
                 </mc:Choice>
                 <mc:Fallback>
                   <w:pict>
-                    <v:rect w14:anchorId="52C438C6" id="_x0000_s1041" style="position:absolute;left:0;text-align:left;margin-left:183.1pt;margin-top:385.75pt;width:48.15pt;height:25.5pt;z-index:251684864;visibility:visible;mso-wrap-style:square;mso-width-percent:0;mso-height-percent:0;mso-wrap-distance-left:9pt;mso-wrap-distance-top:0;mso-wrap-distance-right:9pt;mso-wrap-distance-bottom:0;mso-position-horizontal:absolute;mso-position-horizontal-relative:text;mso-position-vertical:absolute;mso-position-vertical-relative:text;mso-width-percent:0;mso-height-percent:0;mso-width-relative:margin;mso-height-relative:margin;v-text-anchor:middle" o:gfxdata="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" fillcolor="black" strokecolor="red" strokeweight="1pt">
+                    <v:rect w14:anchorId="52C438C6" id="_x0000_s1041" style="position:absolute;left:0;text-align:left;margin-left:183.1pt;margin-top:385.75pt;width:48.15pt;height:25.5pt;z-index:251771904;visibility:visible;mso-wrap-style:square;mso-width-percent:0;mso-height-percent:0;mso-wrap-distance-left:9pt;mso-wrap-distance-top:0;mso-wrap-distance-right:9pt;mso-wrap-distance-bottom:0;mso-position-horizontal:absolute;mso-position-horizontal-relative:text;mso-position-vertical:absolute;mso-position-vertical-relative:text;mso-width-percent:0;mso-height-percent:0;mso-width-relative:margin;mso-height-relative:margin;v-text-anchor:middle" o:gfxdata="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" fillcolor="black" strokecolor="red" strokeweight="1pt">
                       <v:fill opacity="39321f"/>
                       <v:textbox inset="0,0,0,0">
                         <w:txbxContent>
@@ -4603,6 +4595,7 @@
             </w:r>
             <w:r>
               <w:rPr>
+                <w:noProof/>
                 <w:color w:val="FFFFFF" w:themeColor="background1"/>
                 <w:sz w:val="32"/>
                 <w:szCs w:val="32"/>
@@ -4723,6 +4716,81 @@
       </w:pPr>
       <w:r>
         <w:rPr>
+          <w:noProof/>
+        </w:rPr>
+        <w:drawing>
+          <wp:anchor distT="0" distB="0" distL="114300" distR="114300" simplePos="0" relativeHeight="251730944" behindDoc="0" locked="0" layoutInCell="1" allowOverlap="1" wp14:anchorId="1E5B8D47" wp14:editId="2C1D3AEC">
+            <wp:simplePos x="0" y="0"/>
+            <wp:positionH relativeFrom="column">
+              <wp:posOffset>3065145</wp:posOffset>
+            </wp:positionH>
+            <wp:positionV relativeFrom="paragraph">
+              <wp:posOffset>-7345362</wp:posOffset>
+            </wp:positionV>
+            <wp:extent cx="719455" cy="269240"/>
+            <wp:effectExtent l="38100" t="38100" r="80645" b="92710"/>
+            <wp:wrapNone/>
+            <wp:docPr id="455724338" name="Picture 1" descr="Train Simulator Classic - Wikipedia"/>
+            <wp:cNvGraphicFramePr>
+              <a:graphicFrameLocks xmlns:a="http://schemas.openxmlformats.org/drawingml/2006/main" noChangeAspect="1"/>
+            </wp:cNvGraphicFramePr>
+            <a:graphic xmlns:a="http://schemas.openxmlformats.org/drawingml/2006/main">
+              <a:graphicData uri="http://schemas.openxmlformats.org/drawingml/2006/picture">
+                <pic:pic xmlns:pic="http://schemas.openxmlformats.org/drawingml/2006/picture">
+                  <pic:nvPicPr>
+                    <pic:cNvPr id="0" name="Picture 1" descr="Train Simulator Classic - Wikipedia"/>
+                    <pic:cNvPicPr>
+                      <a:picLocks noChangeAspect="1" noChangeArrowheads="1"/>
+                    </pic:cNvPicPr>
+                  </pic:nvPicPr>
+                  <pic:blipFill>
+                    <a:blip r:embed="rId16" cstate="print">
+                      <a:extLst>
+                        <a:ext uri="{28A0092B-C50C-407E-A947-70E740481C1C}">
+                          <a14:useLocalDpi xmlns:a14="http://schemas.microsoft.com/office/drawing/2010/main" val="0"/>
+                        </a:ext>
+                      </a:extLst>
+                    </a:blip>
+                    <a:srcRect/>
+                    <a:stretch>
+                      <a:fillRect/>
+                    </a:stretch>
+                  </pic:blipFill>
+                  <pic:spPr bwMode="auto">
+                    <a:xfrm>
+                      <a:off x="0" y="0"/>
+                      <a:ext cx="719455" cy="269240"/>
+                    </a:xfrm>
+                    <a:prstGeom prst="rect">
+                      <a:avLst/>
+                    </a:prstGeom>
+                    <a:noFill/>
+                    <a:ln>
+                      <a:noFill/>
+                    </a:ln>
+                    <a:effectLst>
+                      <a:outerShdw blurRad="50800" dist="38100" dir="2700000" algn="tl" rotWithShape="0">
+                        <a:prstClr val="black">
+                          <a:alpha val="40000"/>
+                        </a:prstClr>
+                      </a:outerShdw>
+                    </a:effectLst>
+                  </pic:spPr>
+                </pic:pic>
+              </a:graphicData>
+            </a:graphic>
+            <wp14:sizeRelH relativeFrom="page">
+              <wp14:pctWidth>0</wp14:pctWidth>
+            </wp14:sizeRelH>
+            <wp14:sizeRelV relativeFrom="page">
+              <wp14:pctHeight>0</wp14:pctHeight>
+            </wp14:sizeRelV>
+          </wp:anchor>
+        </w:drawing>
+      </w:r>
+      <w:r>
+        <w:rPr>
+          <w:noProof/>
           <w:color w:val="FFFFFF" w:themeColor="background1"/>
           <w:sz w:val="32"/>
           <w:szCs w:val="32"/>
@@ -5595,6 +5663,7 @@
       </w:r>
       <w:r>
         <w:rPr>
+          <w:noProof/>
           <w:sz w:val="32"/>
           <w:szCs w:val="32"/>
         </w:rPr>
@@ -5766,6 +5835,9 @@
         </mc:AlternateContent>
       </w:r>
       <w:r>
+        <w:rPr>
+          <w:noProof/>
+        </w:rPr>
         <mc:AlternateContent>
           <mc:Choice Requires="wps">
             <w:drawing>
@@ -5971,31 +6043,7 @@
                 <w:szCs w:val="28"/>
                 <w:lang w:val="nl-NL"/>
               </w:rPr>
-              <w:t>Set master (</w:t>
-            </w:r>
-            <w:r>
-              <w:rPr>
-                <w:rFonts w:asciiTheme="majorHAnsi" w:hAnsiTheme="majorHAnsi"/>
-                <w:b/>
-                <w:bCs/>
-                <w:color w:val="FFFFFF" w:themeColor="background1"/>
-                <w:sz w:val="28"/>
-                <w:szCs w:val="28"/>
-                <w:lang w:val="nl-NL"/>
-              </w:rPr>
-              <w:t>stuurstroom</w:t>
-            </w:r>
-            <w:r>
-              <w:rPr>
-                <w:rFonts w:asciiTheme="majorHAnsi" w:hAnsiTheme="majorHAnsi"/>
-                <w:b/>
-                <w:bCs/>
-                <w:color w:val="FFFFFF" w:themeColor="background1"/>
-                <w:sz w:val="28"/>
-                <w:szCs w:val="28"/>
-                <w:lang w:val="nl-NL"/>
-              </w:rPr>
-              <w:t>)</w:t>
+              <w:t>Set master (stuurstroom)</w:t>
             </w:r>
             <w:r>
               <w:rPr>
@@ -6340,18 +6388,7 @@
                 <w:sz w:val="28"/>
                 <w:szCs w:val="28"/>
               </w:rPr>
-              <w:t>Set headlights</w:t>
-            </w:r>
-            <w:r>
-              <w:rPr>
-                <w:rFonts w:asciiTheme="majorHAnsi" w:hAnsiTheme="majorHAnsi"/>
-                <w:b/>
-                <w:bCs/>
-                <w:color w:val="FFFFFF" w:themeColor="background1"/>
-                <w:sz w:val="28"/>
-                <w:szCs w:val="28"/>
-              </w:rPr>
-              <w:t xml:space="preserve"> </w:t>
+              <w:t xml:space="preserve">Set headlights </w:t>
             </w:r>
           </w:p>
           <w:p>
@@ -6740,7 +6777,7 @@
               </w:rPr>
               <w:t xml:space="preserve"> </w:t>
             </w:r>
-            <w:hyperlink r:id="rId16" w:history="1">
+            <w:hyperlink r:id="rId17" w:history="1">
               <w:r>
                 <w:rPr>
                   <w:rStyle w:val="Hyperlink"/>
@@ -7921,6 +7958,7 @@
   <w:style w:type="character" w:default="1" w:styleId="DefaultParagraphFont">
     <w:name w:val="Default Paragraph Font"/>
     <w:uiPriority w:val="1"/>
+    <w:semiHidden/>
     <w:unhideWhenUsed/>
   </w:style>
   <w:style w:type="table" w:default="1" w:styleId="TableNormal">

</xml_diff>